<commit_message>
scatter grey for SAE 1
</commit_message>
<xml_diff>
--- a/apl/doc/apl_cyril_v3.docx
+++ b/apl/doc/apl_cyril_v3.docx
@@ -185,7 +185,7 @@
       <w:r>
         <w:t xml:space="preserve"> mise à jour annuelle systématique. Les données disponibles peuvent être consultées à cette adresse : </w:t>
       </w:r>
-      <w:hyperlink r:id="rId6" w:history="1">
+      <w:hyperlink r:id="rId8" w:history="1">
         <w:r>
           <w:rPr>
             <w:rStyle w:val="Lienhypertexte"/>
@@ -270,7 +270,7 @@
       <w:r>
         <w:t xml:space="preserve"> en 2025 (</w:t>
       </w:r>
-      <w:hyperlink r:id="rId7" w:history="1">
+      <w:hyperlink r:id="rId9" w:history="1">
         <w:r>
           <w:rPr>
             <w:rStyle w:val="Lienhypertexte"/>
@@ -640,7 +640,7 @@
         </w:rPr>
         <w:t xml:space="preserve">: </w:t>
       </w:r>
-      <w:hyperlink r:id="rId8" w:history="1">
+      <w:hyperlink r:id="rId10" w:history="1">
         <w:r>
           <w:rPr>
             <w:rStyle w:val="Lienhypertexte"/>
@@ -710,7 +710,7 @@
         </w:rPr>
         <w:t xml:space="preserve">URL : </w:t>
       </w:r>
-      <w:hyperlink r:id="rId9" w:history="1">
+      <w:hyperlink r:id="rId11" w:history="1">
         <w:r>
           <w:rPr>
             <w:rStyle w:val="Lienhypertexte"/>
@@ -799,7 +799,7 @@
         </w:rPr>
         <w:t xml:space="preserve">: </w:t>
       </w:r>
-      <w:hyperlink r:id="rId10" w:history="1">
+      <w:hyperlink r:id="rId12" w:history="1">
         <w:r>
           <w:rPr>
             <w:rStyle w:val="Lienhypertexte"/>
@@ -883,7 +883,7 @@
         </w:rPr>
         <w:t xml:space="preserve">URL : </w:t>
       </w:r>
-      <w:hyperlink r:id="rId11" w:history="1">
+      <w:hyperlink r:id="rId13" w:history="1">
         <w:r>
           <w:rPr>
             <w:rStyle w:val="Lienhypertexte"/>
@@ -961,7 +961,7 @@
         </w:rPr>
         <w:t xml:space="preserve">URL : </w:t>
       </w:r>
-      <w:hyperlink r:id="rId12" w:history="1">
+      <w:hyperlink r:id="rId14" w:history="1">
         <w:r>
           <w:rPr>
             <w:rStyle w:val="Lienhypertexte"/>
@@ -1026,7 +1026,7 @@
       <w:r>
         <w:t xml:space="preserve">URL : </w:t>
       </w:r>
-      <w:hyperlink r:id="rId13" w:history="1">
+      <w:hyperlink r:id="rId15" w:history="1">
         <w:r>
           <w:rPr>
             <w:rStyle w:val="Lienhypertexte"/>
@@ -1100,7 +1100,7 @@
         </w:rPr>
         <w:t xml:space="preserve">URL : </w:t>
       </w:r>
-      <w:hyperlink r:id="rId14" w:history="1">
+      <w:hyperlink r:id="rId16" w:history="1">
         <w:r>
           <w:rPr>
             <w:rStyle w:val="Lienhypertexte"/>
@@ -1170,7 +1170,7 @@
         </w:rPr>
         <w:t xml:space="preserve">URL : </w:t>
       </w:r>
-      <w:hyperlink r:id="rId15" w:history="1">
+      <w:hyperlink r:id="rId17" w:history="1">
         <w:r>
           <w:rPr>
             <w:rStyle w:val="Lienhypertexte"/>
@@ -1295,7 +1295,7 @@
         </w:rPr>
         <w:t xml:space="preserve">URL : </w:t>
       </w:r>
-      <w:hyperlink r:id="rId20" w:history="1">
+      <w:hyperlink r:id="rId22" w:history="1">
         <w:r>
           <w:rPr>
             <w:rStyle w:val="Lienhypertexte"/>
@@ -1383,7 +1383,7 @@
         </w:rPr>
         <w:t xml:space="preserve">URL : </w:t>
       </w:r>
-      <w:hyperlink r:id="rId21" w:history="1">
+      <w:hyperlink r:id="rId23" w:history="1">
         <w:r>
           <w:rPr>
             <w:rStyle w:val="Lienhypertexte"/>
@@ -1462,7 +1462,7 @@
         </w:rPr>
         <w:t xml:space="preserve">URL : </w:t>
       </w:r>
-      <w:hyperlink r:id="rId22" w:history="1">
+      <w:hyperlink r:id="rId24" w:history="1">
         <w:r>
           <w:rPr>
             <w:rStyle w:val="Lienhypertexte"/>
@@ -1563,7 +1563,7 @@
         </w:rPr>
         <w:t xml:space="preserve">URL : </w:t>
       </w:r>
-      <w:hyperlink r:id="rId23" w:history="1">
+      <w:hyperlink r:id="rId25" w:history="1">
         <w:r>
           <w:rPr>
             <w:rStyle w:val="Lienhypertexte"/>
@@ -1635,7 +1635,7 @@
         </w:rPr>
         <w:t xml:space="preserve">URL : </w:t>
       </w:r>
-      <w:hyperlink r:id="rId24" w:history="1">
+      <w:hyperlink r:id="rId26" w:history="1">
         <w:r>
           <w:rPr>
             <w:rStyle w:val="Lienhypertexte"/>
@@ -1708,7 +1708,7 @@
         </w:rPr>
         <w:t xml:space="preserve">URL : </w:t>
       </w:r>
-      <w:hyperlink r:id="rId25" w:history="1">
+      <w:hyperlink r:id="rId27" w:history="1">
         <w:r>
           <w:rPr>
             <w:rStyle w:val="Lienhypertexte"/>
@@ -2455,7 +2455,7 @@
           <w14:ligatures w14:val="none"/>
         </w:rPr>
       </w:pPr>
-      <w:hyperlink r:id="rId26" w:history="1">
+      <w:hyperlink r:id="rId28" w:history="1">
         <w:r>
           <w:rPr>
             <w:rStyle w:val="Lienhypertexte"/>
@@ -2646,7 +2646,7 @@
                     <pic:cNvPicPr/>
                   </pic:nvPicPr>
                   <pic:blipFill>
-                    <a:blip r:embed="rId27"/>
+                    <a:blip r:embed="rId29"/>
                     <a:stretch>
                       <a:fillRect/>
                     </a:stretch>
@@ -2888,7 +2888,7 @@
                     <pic:cNvPicPr/>
                   </pic:nvPicPr>
                   <pic:blipFill>
-                    <a:blip r:embed="rId28"/>
+                    <a:blip r:embed="rId30"/>
                     <a:stretch>
                       <a:fillRect/>
                     </a:stretch>
@@ -5723,6 +5723,781 @@
         <w:pStyle w:val="Titre3"/>
       </w:pPr>
       <w:r>
+        <w:t>Calcul du taux de recours différencié</w:t>
+      </w:r>
+    </w:p>
+    <w:p/>
+    <w:p>
+      <w:pPr>
+        <w:jc w:val="both"/>
+        <w:rPr>
+          <w:rFonts w:eastAsiaTheme="minorEastAsia"/>
+        </w:rPr>
+      </w:pPr>
+      <w:r>
+        <w:t>Le taux de recours différencié pour la tranche d’âge</w:t>
+      </w:r>
+      <w:r>
+        <w:rPr>
+          <w:rFonts w:ascii="Cambria Math" w:eastAsiaTheme="minorEastAsia" w:hAnsi="Cambria Math"/>
+          <w:i/>
+        </w:rPr>
+        <w:t xml:space="preserve"> </w:t>
+      </w:r>
+      <m:oMath>
+        <m:r>
+          <w:rPr>
+            <w:rFonts w:ascii="Cambria Math" w:eastAsiaTheme="minorEastAsia" w:hAnsi="Cambria Math"/>
+          </w:rPr>
+          <m:t>a</m:t>
+        </m:r>
+      </m:oMath>
+      <w:r>
+        <w:rPr>
+          <w:rFonts w:eastAsiaTheme="minorEastAsia"/>
+        </w:rPr>
+        <w:t xml:space="preserve"> pour la spécialité </w:t>
+      </w:r>
+      <m:oMath>
+        <m:r>
+          <w:rPr>
+            <w:rFonts w:ascii="Cambria Math" w:eastAsiaTheme="minorEastAsia" w:hAnsi="Cambria Math"/>
+          </w:rPr>
+          <m:t>s</m:t>
+        </m:r>
+      </m:oMath>
+      <w:r>
+        <w:rPr>
+          <w:rFonts w:eastAsiaTheme="minorEastAsia"/>
+        </w:rPr>
+        <w:t xml:space="preserve"> </w:t>
+      </w:r>
+      <w:commentRangeStart w:id="6"/>
+      <w:commentRangeStart w:id="7"/>
+      <m:oMath>
+        <m:sSub>
+          <m:sSubPr>
+            <m:ctrlPr>
+              <w:rPr>
+                <w:rFonts w:ascii="Cambria Math" w:eastAsiaTheme="minorEastAsia" w:hAnsi="Cambria Math" w:cs="Courier New"/>
+                <w:i/>
+              </w:rPr>
+            </m:ctrlPr>
+          </m:sSubPr>
+          <m:e>
+            <m:r>
+              <w:rPr>
+                <w:rFonts w:ascii="Cambria Math" w:eastAsiaTheme="minorEastAsia" w:hAnsi="Cambria Math" w:cs="Courier New"/>
+              </w:rPr>
+              <m:t>TR</m:t>
+            </m:r>
+          </m:e>
+          <m:sub>
+            <m:r>
+              <w:rPr>
+                <w:rFonts w:ascii="Cambria Math" w:eastAsiaTheme="minorEastAsia" w:hAnsi="Cambria Math" w:cs="Courier New"/>
+              </w:rPr>
+              <m:t>as</m:t>
+            </m:r>
+          </m:sub>
+        </m:sSub>
+      </m:oMath>
+      <w:commentRangeEnd w:id="6"/>
+      <w:r>
+        <w:rPr>
+          <w:rStyle w:val="Marquedecommentaire"/>
+          <w:rFonts w:eastAsiaTheme="minorEastAsia"/>
+          <w:sz w:val="22"/>
+          <w:szCs w:val="22"/>
+        </w:rPr>
+        <w:commentReference w:id="6"/>
+      </w:r>
+      <w:commentRangeEnd w:id="7"/>
+      <w:r>
+        <w:rPr>
+          <w:rStyle w:val="Marquedecommentaire"/>
+          <w:rFonts w:eastAsiaTheme="minorEastAsia"/>
+          <w:sz w:val="22"/>
+          <w:szCs w:val="22"/>
+        </w:rPr>
+        <w:commentReference w:id="7"/>
+      </w:r>
+      <w:r>
+        <w:rPr>
+          <w:rFonts w:eastAsiaTheme="minorEastAsia"/>
+        </w:rPr>
+        <w:t xml:space="preserve"> représente la sur ou sous-représentation d’une classe d’âge dans le taux de recours à une spécialité afin de mesurer la demande réelle d’un IRIS.</w:t>
+      </w:r>
+    </w:p>
+    <w:p>
+      <w:pPr>
+        <w:jc w:val="both"/>
+        <w:rPr>
+          <w:rFonts w:eastAsiaTheme="minorEastAsia"/>
+        </w:rPr>
+      </w:pPr>
+    </w:p>
+    <w:p>
+      <w:pPr>
+        <w:jc w:val="both"/>
+      </w:pPr>
+      <w:r>
+        <w:t>D’après la base de données INSEE – IRIS nous connaissons la répartition des habitants par classe d’âge, par IRIS et par année.</w:t>
+      </w:r>
+    </w:p>
+    <w:p>
+      <w:pPr>
+        <w:jc w:val="both"/>
+      </w:pPr>
+    </w:p>
+    <w:p>
+      <w:pPr>
+        <w:jc w:val="both"/>
+      </w:pPr>
+      <w:r>
+        <w:t>D’après la base de données Ameli – Open DAMIR nous connaissons le taux de recours aux différentes spécialités par classe d’âge et par année.</w:t>
+      </w:r>
+    </w:p>
+    <w:p>
+      <w:pPr>
+        <w:jc w:val="both"/>
+      </w:pPr>
+      <w:r>
+        <w:lastRenderedPageBreak/>
+        <w:t>Nous avons donc corrélé les 2 bases de données pour connaitre le taux de recours différentié par classe d’âge, par IRIS et par spécialité pour chaque année.</w:t>
+      </w:r>
+    </w:p>
+    <w:p>
+      <w:pPr>
+        <w:jc w:val="both"/>
+      </w:pPr>
+    </w:p>
+    <w:p>
+      <w:pPr>
+        <w:jc w:val="both"/>
+      </w:pPr>
+      <w:r>
+        <w:t xml:space="preserve">Dans OpenDamir nous utilisons </w:t>
+      </w:r>
+      <w:r>
+        <w:t>la</w:t>
+      </w:r>
+      <w:r>
+        <w:t xml:space="preserve"> variable </w:t>
+      </w:r>
+      <w:r>
+        <w:t>psp_spe_snds</w:t>
+      </w:r>
+      <w:r>
+        <w:t xml:space="preserve"> </w:t>
+      </w:r>
+      <w:r>
+        <w:t>qui représente la « </w:t>
+      </w:r>
+      <w:r>
+        <w:t>Spécialité Médicale PS Exécutant</w:t>
+      </w:r>
+      <w:r>
+        <w:t> »</w:t>
+      </w:r>
+      <w:r>
+        <w:t xml:space="preserve"> </w:t>
+      </w:r>
+      <w:r>
+        <w:t xml:space="preserve">et </w:t>
+      </w:r>
+      <w:r>
+        <w:t xml:space="preserve">la variable </w:t>
+      </w:r>
+      <w:r>
+        <w:t>psp_act_snds</w:t>
+      </w:r>
+      <w:r>
+        <w:t xml:space="preserve"> qui représente « </w:t>
+      </w:r>
+      <w:r>
+        <w:t>Nature d'Activité PS Prescripteur</w:t>
+      </w:r>
+      <w:r>
+        <w:t> ».</w:t>
+      </w:r>
+    </w:p>
+    <w:p>
+      <w:pPr>
+        <w:jc w:val="both"/>
+      </w:pPr>
+    </w:p>
+    <w:p>
+      <w:pPr>
+        <w:jc w:val="both"/>
+      </w:pPr>
+      <w:r>
+        <w:t>Nous calculons ensuite les ratios de répartitions des classes d’âge de la population générale</w:t>
+      </w:r>
+      <w:r>
+        <w:t xml:space="preserve">, des hommes et des femmes </w:t>
+      </w:r>
+      <w:r>
+        <w:t>depuis la base INSEE avec les classes d’âge suivante :</w:t>
+      </w:r>
+    </w:p>
+    <w:p>
+      <w:pPr>
+        <w:pStyle w:val="Paragraphedeliste"/>
+        <w:numPr>
+          <w:ilvl w:val="0"/>
+          <w:numId w:val="48"/>
+        </w:numPr>
+        <w:jc w:val="both"/>
+      </w:pPr>
+      <w:r>
+        <w:t>P0002 : De 0 à 2 ans</w:t>
+      </w:r>
+    </w:p>
+    <w:p>
+      <w:pPr>
+        <w:pStyle w:val="Paragraphedeliste"/>
+        <w:numPr>
+          <w:ilvl w:val="0"/>
+          <w:numId w:val="48"/>
+        </w:numPr>
+        <w:jc w:val="both"/>
+      </w:pPr>
+      <w:r>
+        <w:t>P0305 : De 3 à 5 ans</w:t>
+      </w:r>
+    </w:p>
+    <w:p>
+      <w:pPr>
+        <w:pStyle w:val="Paragraphedeliste"/>
+        <w:numPr>
+          <w:ilvl w:val="0"/>
+          <w:numId w:val="48"/>
+        </w:numPr>
+        <w:jc w:val="both"/>
+      </w:pPr>
+      <w:r>
+        <w:t>P0610 : De 6 à 10 ans</w:t>
+      </w:r>
+    </w:p>
+    <w:p>
+      <w:pPr>
+        <w:pStyle w:val="Paragraphedeliste"/>
+        <w:numPr>
+          <w:ilvl w:val="0"/>
+          <w:numId w:val="48"/>
+        </w:numPr>
+        <w:jc w:val="both"/>
+      </w:pPr>
+      <w:r>
+        <w:t>P1117 : De 11 à 17 ans</w:t>
+      </w:r>
+    </w:p>
+    <w:p>
+      <w:pPr>
+        <w:pStyle w:val="Paragraphedeliste"/>
+        <w:numPr>
+          <w:ilvl w:val="0"/>
+          <w:numId w:val="48"/>
+        </w:numPr>
+        <w:jc w:val="both"/>
+      </w:pPr>
+      <w:r>
+        <w:t>P1824 : De 18 à 24 ans</w:t>
+      </w:r>
+    </w:p>
+    <w:p>
+      <w:pPr>
+        <w:pStyle w:val="Paragraphedeliste"/>
+        <w:numPr>
+          <w:ilvl w:val="0"/>
+          <w:numId w:val="48"/>
+        </w:numPr>
+        <w:jc w:val="both"/>
+      </w:pPr>
+      <w:r>
+        <w:t>P2539 : De 25 à 39 ans</w:t>
+      </w:r>
+    </w:p>
+    <w:p>
+      <w:pPr>
+        <w:pStyle w:val="Paragraphedeliste"/>
+        <w:numPr>
+          <w:ilvl w:val="0"/>
+          <w:numId w:val="48"/>
+        </w:numPr>
+        <w:jc w:val="both"/>
+      </w:pPr>
+      <w:r>
+        <w:t>P4054 : De 40 à 54 ans</w:t>
+      </w:r>
+    </w:p>
+    <w:p>
+      <w:pPr>
+        <w:pStyle w:val="Paragraphedeliste"/>
+        <w:numPr>
+          <w:ilvl w:val="0"/>
+          <w:numId w:val="48"/>
+        </w:numPr>
+        <w:jc w:val="both"/>
+      </w:pPr>
+      <w:r>
+        <w:t>P5564 : De 55 à 64 ans</w:t>
+      </w:r>
+    </w:p>
+    <w:p>
+      <w:pPr>
+        <w:pStyle w:val="Paragraphedeliste"/>
+        <w:numPr>
+          <w:ilvl w:val="0"/>
+          <w:numId w:val="48"/>
+        </w:numPr>
+        <w:jc w:val="both"/>
+      </w:pPr>
+      <w:r>
+        <w:t>P6579 : De 65 à 79 ans</w:t>
+      </w:r>
+    </w:p>
+    <w:p>
+      <w:pPr>
+        <w:pStyle w:val="Paragraphedeliste"/>
+        <w:numPr>
+          <w:ilvl w:val="0"/>
+          <w:numId w:val="48"/>
+        </w:numPr>
+        <w:jc w:val="both"/>
+      </w:pPr>
+      <w:r>
+        <w:t>P80P : Après 80 ans</w:t>
+      </w:r>
+    </w:p>
+    <w:p>
+      <w:pPr>
+        <w:jc w:val="both"/>
+      </w:pPr>
+    </w:p>
+    <w:p>
+      <w:pPr>
+        <w:jc w:val="both"/>
+      </w:pPr>
+      <w:r>
+        <w:t>Taux de répartition de la population Française par classe d’âge</w:t>
+      </w:r>
+    </w:p>
+    <w:p>
+      <w:pPr>
+        <w:jc w:val="both"/>
+      </w:pPr>
+    </w:p>
+    <w:p>
+      <w:pPr>
+        <w:jc w:val="both"/>
+      </w:pPr>
+      <w:r>
+        <w:drawing>
+          <wp:inline distT="0" distB="0" distL="0" distR="0" wp14:anchorId="30010E82" wp14:editId="42BFFEC4">
+            <wp:extent cx="5760720" cy="1454150"/>
+            <wp:effectExtent l="0" t="0" r="0" b="0"/>
+            <wp:docPr id="929349616" name="Image 1"/>
+            <wp:cNvGraphicFramePr>
+              <a:graphicFrameLocks xmlns:a="http://schemas.openxmlformats.org/drawingml/2006/main" noChangeAspect="1"/>
+            </wp:cNvGraphicFramePr>
+            <a:graphic xmlns:a="http://schemas.openxmlformats.org/drawingml/2006/main">
+              <a:graphicData uri="http://schemas.openxmlformats.org/drawingml/2006/picture">
+                <pic:pic xmlns:pic="http://schemas.openxmlformats.org/drawingml/2006/picture">
+                  <pic:nvPicPr>
+                    <pic:cNvPr id="929349616" name=""/>
+                    <pic:cNvPicPr/>
+                  </pic:nvPicPr>
+                  <pic:blipFill>
+                    <a:blip r:embed="rId31"/>
+                    <a:stretch>
+                      <a:fillRect/>
+                    </a:stretch>
+                  </pic:blipFill>
+                  <pic:spPr>
+                    <a:xfrm>
+                      <a:off x="0" y="0"/>
+                      <a:ext cx="5760720" cy="1454150"/>
+                    </a:xfrm>
+                    <a:prstGeom prst="rect">
+                      <a:avLst/>
+                    </a:prstGeom>
+                  </pic:spPr>
+                </pic:pic>
+              </a:graphicData>
+            </a:graphic>
+          </wp:inline>
+        </w:drawing>
+      </w:r>
+    </w:p>
+    <w:p>
+      <w:pPr>
+        <w:jc w:val="both"/>
+      </w:pPr>
+    </w:p>
+    <w:p>
+      <w:pPr>
+        <w:jc w:val="both"/>
+      </w:pPr>
+      <w:r>
+        <w:t xml:space="preserve">Depuis la base OpenDAMIR nous connaissons le taux de recours d’une classe d’âge </w:t>
+      </w:r>
+      <w:r>
+        <w:t xml:space="preserve">de la population générale, des hommes et des femmes </w:t>
+      </w:r>
+      <w:r>
+        <w:t>à une spécialité.</w:t>
+      </w:r>
+    </w:p>
+    <w:p>
+      <w:pPr>
+        <w:jc w:val="both"/>
+      </w:pPr>
+    </w:p>
+    <w:p>
+      <w:pPr>
+        <w:jc w:val="both"/>
+      </w:pPr>
+      <w:r>
+        <w:t>Hélas, l</w:t>
+      </w:r>
+      <w:r>
+        <w:t xml:space="preserve">a </w:t>
+      </w:r>
+      <w:r>
+        <w:t>répartition</w:t>
+      </w:r>
+      <w:r>
+        <w:t xml:space="preserve"> des données DAMIR et INSEE n’est pas la même. DAMIR classe les populations par tranches de 10 ans, sauf pour les 0-20 ans et les plus de 80 ans, tandis que l’INSEE les classes plus finement : 0-2 ans, 3-5, 6-10, 11-17, 18-24, 25-39, 40-54, 55-65, 65-78 et 80+.</w:t>
+      </w:r>
+    </w:p>
+    <w:p>
+      <w:pPr>
+        <w:jc w:val="both"/>
+      </w:pPr>
+    </w:p>
+    <w:p>
+      <w:pPr>
+        <w:jc w:val="both"/>
+        <w:rPr>
+          <w:kern w:val="0"/>
+          <w14:ligatures w14:val="none"/>
+        </w:rPr>
+      </w:pPr>
+      <w:r>
+        <w:t xml:space="preserve"> Une interpolation linéaire a donc été calculée pour effectuer la correspondance entre INSEE et DAMIR.</w:t>
+      </w:r>
+    </w:p>
+    <w:p>
+      <w:pPr>
+        <w:jc w:val="both"/>
+      </w:pPr>
+    </w:p>
+    <w:p>
+      <w:pPr>
+        <w:jc w:val="both"/>
+      </w:pPr>
+      <w:r>
+        <w:rPr>
+          <w:b/>
+          <w:bCs/>
+        </w:rPr>
+        <w:t>Cas particulier des moins de 20 ans :</w:t>
+      </w:r>
+      <w:r>
+        <w:t xml:space="preserve"> DAMIR n’a qu’une classe d’âge pour les moins de 20 ans alors que l’INSEE est plus fin avec 5 classes d’âge. La répartition a été faite linéairement comme suit :</w:t>
+      </w:r>
+    </w:p>
+    <w:p>
+      <w:pPr>
+        <w:pStyle w:val="Paragraphedeliste"/>
+        <w:numPr>
+          <w:ilvl w:val="0"/>
+          <w:numId w:val="27"/>
+        </w:numPr>
+        <w:spacing w:line="256" w:lineRule="auto"/>
+        <w:jc w:val="both"/>
+        <w:rPr>
+          <w:rFonts w:eastAsia="Times New Roman"/>
+          <w:kern w:val="0"/>
+          <w14:ligatures w14:val="none"/>
+        </w:rPr>
+      </w:pPr>
+      <w:r>
+        <w:rPr>
+          <w:rFonts w:eastAsia="Times New Roman"/>
+        </w:rPr>
+        <w:t>3/20</w:t>
+      </w:r>
+      <w:r>
+        <w:rPr>
+          <w:rFonts w:eastAsia="Times New Roman"/>
+          <w:vertAlign w:val="superscript"/>
+        </w:rPr>
+        <w:t>e</w:t>
+      </w:r>
+      <w:r>
+        <w:rPr>
+          <w:rFonts w:eastAsia="Times New Roman"/>
+        </w:rPr>
+        <w:t xml:space="preserve"> des données de la classe d’âge 0-20 ans (DAMIR) ont été affectées à la classe d’âge 0-2 ans (INSEE), sauf pour les pédiatres : </w:t>
+      </w:r>
+      <w:r>
+        <w:rPr>
+          <w:rFonts w:eastAsia="Times New Roman"/>
+        </w:rPr>
+        <w:t>7</w:t>
+      </w:r>
+      <w:r>
+        <w:rPr>
+          <w:rFonts w:eastAsia="Times New Roman"/>
+        </w:rPr>
+        <w:t>/20</w:t>
+      </w:r>
+      <w:r>
+        <w:rPr>
+          <w:rFonts w:eastAsia="Times New Roman"/>
+          <w:vertAlign w:val="superscript"/>
+        </w:rPr>
+        <w:t>e</w:t>
+      </w:r>
+    </w:p>
+    <w:p>
+      <w:pPr>
+        <w:pStyle w:val="Paragraphedeliste"/>
+        <w:numPr>
+          <w:ilvl w:val="0"/>
+          <w:numId w:val="27"/>
+        </w:numPr>
+        <w:spacing w:line="256" w:lineRule="auto"/>
+        <w:jc w:val="both"/>
+        <w:rPr>
+          <w:rFonts w:eastAsia="Times New Roman"/>
+          <w:kern w:val="0"/>
+          <w14:ligatures w14:val="none"/>
+        </w:rPr>
+      </w:pPr>
+      <w:r>
+        <w:rPr>
+          <w:rFonts w:eastAsia="Times New Roman"/>
+        </w:rPr>
+        <w:t>3/20</w:t>
+      </w:r>
+      <w:r>
+        <w:rPr>
+          <w:rFonts w:eastAsia="Times New Roman"/>
+          <w:vertAlign w:val="superscript"/>
+        </w:rPr>
+        <w:t>e</w:t>
+      </w:r>
+      <w:r>
+        <w:rPr>
+          <w:rFonts w:eastAsia="Times New Roman"/>
+        </w:rPr>
+        <w:t xml:space="preserve"> affectées à la classe d’âge 3-5</w:t>
+      </w:r>
+    </w:p>
+    <w:p>
+      <w:pPr>
+        <w:pStyle w:val="Paragraphedeliste"/>
+        <w:numPr>
+          <w:ilvl w:val="0"/>
+          <w:numId w:val="27"/>
+        </w:numPr>
+        <w:spacing w:line="256" w:lineRule="auto"/>
+        <w:jc w:val="both"/>
+        <w:rPr>
+          <w:rFonts w:eastAsia="Times New Roman"/>
+          <w:kern w:val="0"/>
+          <w14:ligatures w14:val="none"/>
+        </w:rPr>
+      </w:pPr>
+      <w:r>
+        <w:rPr>
+          <w:rFonts w:eastAsia="Times New Roman"/>
+        </w:rPr>
+        <w:lastRenderedPageBreak/>
+        <w:t>5/20</w:t>
+      </w:r>
+      <w:r>
+        <w:rPr>
+          <w:rFonts w:eastAsia="Times New Roman"/>
+          <w:vertAlign w:val="superscript"/>
+        </w:rPr>
+        <w:t>e</w:t>
+      </w:r>
+      <w:r>
+        <w:rPr>
+          <w:rFonts w:eastAsia="Times New Roman"/>
+        </w:rPr>
+        <w:t xml:space="preserve"> affectées à la classe d’âge 6-10, sauf pour les pédiatres : 4/20</w:t>
+      </w:r>
+      <w:r>
+        <w:rPr>
+          <w:rFonts w:eastAsia="Times New Roman"/>
+          <w:vertAlign w:val="superscript"/>
+        </w:rPr>
+        <w:t>e</w:t>
+      </w:r>
+    </w:p>
+    <w:p>
+      <w:pPr>
+        <w:pStyle w:val="Paragraphedeliste"/>
+        <w:numPr>
+          <w:ilvl w:val="0"/>
+          <w:numId w:val="27"/>
+        </w:numPr>
+        <w:spacing w:line="256" w:lineRule="auto"/>
+        <w:jc w:val="both"/>
+        <w:rPr>
+          <w:rFonts w:eastAsia="Times New Roman"/>
+          <w:kern w:val="0"/>
+          <w14:ligatures w14:val="none"/>
+        </w:rPr>
+      </w:pPr>
+      <w:r>
+        <w:rPr>
+          <w:rFonts w:eastAsia="Times New Roman"/>
+        </w:rPr>
+        <w:t>7/20</w:t>
+      </w:r>
+      <w:r>
+        <w:rPr>
+          <w:rFonts w:eastAsia="Times New Roman"/>
+          <w:vertAlign w:val="superscript"/>
+        </w:rPr>
+        <w:t>e</w:t>
+      </w:r>
+      <w:r>
+        <w:rPr>
+          <w:rFonts w:eastAsia="Times New Roman"/>
+        </w:rPr>
+        <w:t xml:space="preserve"> affectées à la classe d’âge 11-17, sauf pour les pédiatres : 5/20</w:t>
+      </w:r>
+      <w:r>
+        <w:rPr>
+          <w:rFonts w:eastAsia="Times New Roman"/>
+          <w:vertAlign w:val="superscript"/>
+        </w:rPr>
+        <w:t>e</w:t>
+      </w:r>
+    </w:p>
+    <w:p>
+      <w:pPr>
+        <w:pStyle w:val="Paragraphedeliste"/>
+        <w:numPr>
+          <w:ilvl w:val="0"/>
+          <w:numId w:val="27"/>
+        </w:numPr>
+        <w:spacing w:line="256" w:lineRule="auto"/>
+        <w:jc w:val="both"/>
+        <w:rPr>
+          <w:rFonts w:eastAsia="Times New Roman"/>
+          <w:kern w:val="0"/>
+          <w14:ligatures w14:val="none"/>
+        </w:rPr>
+      </w:pPr>
+      <w:r>
+        <w:rPr>
+          <w:rFonts w:eastAsia="Times New Roman"/>
+        </w:rPr>
+        <w:t>2/20</w:t>
+      </w:r>
+      <w:r>
+        <w:rPr>
+          <w:rFonts w:eastAsia="Times New Roman"/>
+          <w:vertAlign w:val="superscript"/>
+        </w:rPr>
+        <w:t>e</w:t>
+      </w:r>
+      <w:r>
+        <w:rPr>
+          <w:rFonts w:eastAsia="Times New Roman"/>
+        </w:rPr>
+        <w:t xml:space="preserve"> affectées à la classe d’âge 18-24, sauf pour les pédiatres : </w:t>
+      </w:r>
+      <w:r>
+        <w:rPr>
+          <w:rFonts w:eastAsia="Times New Roman"/>
+        </w:rPr>
+        <w:t>0</w:t>
+      </w:r>
+      <w:r>
+        <w:rPr>
+          <w:rFonts w:eastAsia="Times New Roman"/>
+        </w:rPr>
+        <w:t>/20</w:t>
+      </w:r>
+      <w:r>
+        <w:rPr>
+          <w:rFonts w:eastAsia="Times New Roman"/>
+          <w:vertAlign w:val="superscript"/>
+        </w:rPr>
+        <w:t>e</w:t>
+      </w:r>
+    </w:p>
+    <w:p>
+      <w:pPr>
+        <w:jc w:val="both"/>
+      </w:pPr>
+    </w:p>
+    <w:p>
+      <w:pPr>
+        <w:jc w:val="both"/>
+      </w:pPr>
+      <w:r>
+        <w:rPr>
+          <w:b/>
+          <w:bCs/>
+        </w:rPr>
+        <w:t>Cas particulier des gynécologues et des sage-femmes</w:t>
+      </w:r>
+      <w:r>
+        <w:t xml:space="preserve"> : seule la population des femmes est prise en compte.</w:t>
+      </w:r>
+    </w:p>
+    <w:p>
+      <w:pPr>
+        <w:jc w:val="both"/>
+      </w:pPr>
+      <w:commentRangeStart w:id="8"/>
+      <w:commentRangeStart w:id="9"/>
+      <w:r>
+        <w:rPr>
+          <w:b/>
+          <w:bCs/>
+        </w:rPr>
+        <w:t>Cas particulier des pédiatres</w:t>
+      </w:r>
+      <w:r>
+        <w:t> : seule la population de moins de 17 ans est prise en compte.</w:t>
+      </w:r>
+      <w:commentRangeEnd w:id="8"/>
+      <w:r>
+        <w:rPr>
+          <w:rStyle w:val="Marquedecommentaire"/>
+          <w:sz w:val="22"/>
+          <w:szCs w:val="22"/>
+        </w:rPr>
+        <w:commentReference w:id="8"/>
+      </w:r>
+      <w:commentRangeEnd w:id="9"/>
+      <w:r>
+        <w:rPr>
+          <w:rStyle w:val="Marquedecommentaire"/>
+          <w:sz w:val="22"/>
+          <w:szCs w:val="22"/>
+        </w:rPr>
+        <w:commentReference w:id="9"/>
+      </w:r>
+    </w:p>
+    <w:p/>
+    <w:p>
+      <w:pPr>
+        <w:pStyle w:val="Titre3"/>
+      </w:pPr>
+      <w:r>
         <w:t>Demande de soins</w:t>
       </w:r>
       <w:r>
@@ -5801,7 +6576,6 @@
         <w:rPr>
           <w:rFonts w:eastAsiaTheme="minorEastAsia" w:cs="Courier New"/>
         </w:rPr>
-        <w:lastRenderedPageBreak/>
         <w:t>L</w:t>
       </w:r>
       <w:r>
@@ -6195,7 +6969,8 @@
         </w:rPr>
         <w:t xml:space="preserve"> </w:t>
       </w:r>
-      <w:commentRangeStart w:id="6"/>
+      <w:commentRangeStart w:id="10"/>
+      <w:commentRangeStart w:id="11"/>
       <m:oMath>
         <m:sSub>
           <m:sSubPr>
@@ -6224,7 +6999,7 @@
           </m:sub>
         </m:sSub>
       </m:oMath>
-      <w:commentRangeEnd w:id="6"/>
+      <w:commentRangeEnd w:id="10"/>
       <w:r>
         <w:rPr>
           <w:rStyle w:val="Marquedecommentaire"/>
@@ -6232,13 +7007,35 @@
           <w:sz w:val="22"/>
           <w:szCs w:val="22"/>
         </w:rPr>
-        <w:commentReference w:id="6"/>
-      </w:r>
-      <w:r>
-        <w:rPr>
+        <w:commentReference w:id="10"/>
+      </w:r>
+      <w:commentRangeEnd w:id="11"/>
+      <w:r>
+        <w:rPr>
+          <w:rStyle w:val="Marquedecommentaire"/>
           <w:rFonts w:eastAsiaTheme="minorEastAsia"/>
-        </w:rPr>
-        <w:t xml:space="preserve"> est le taux de recours moyen pour la tranche d’âge </w:t>
+          <w:sz w:val="22"/>
+          <w:szCs w:val="22"/>
+        </w:rPr>
+        <w:commentReference w:id="11"/>
+      </w:r>
+      <w:r>
+        <w:rPr>
+          <w:rFonts w:eastAsiaTheme="minorEastAsia"/>
+        </w:rPr>
+        <w:t xml:space="preserve"> est le taux de recours </w:t>
+      </w:r>
+      <w:r>
+        <w:rPr>
+          <w:rFonts w:eastAsiaTheme="minorEastAsia"/>
+        </w:rPr>
+        <w:t>différencié</w:t>
+      </w:r>
+      <w:r>
+        <w:rPr>
+          <w:rFonts w:eastAsiaTheme="minorEastAsia"/>
+        </w:rPr>
+        <w:t xml:space="preserve"> pour la tranche d’âge </w:t>
       </w:r>
       <m:oMath>
         <m:r>
@@ -6262,404 +7059,6 @@
           <m:t>s</m:t>
         </m:r>
       </m:oMath>
-    </w:p>
-    <w:p/>
-    <w:p>
-      <w:pPr>
-        <w:jc w:val="both"/>
-      </w:pPr>
-      <w:r>
-        <w:rPr>
-          <w:b/>
-          <w:bCs/>
-        </w:rPr>
-        <w:t>Note :</w:t>
-      </w:r>
-      <w:r>
-        <w:t xml:space="preserve"> </w:t>
-      </w:r>
-    </w:p>
-    <w:p>
-      <w:pPr>
-        <w:jc w:val="both"/>
-        <w:rPr>
-          <w:kern w:val="0"/>
-          <w14:ligatures w14:val="none"/>
-        </w:rPr>
-      </w:pPr>
-      <w:r>
-        <w:t>La granularité des données DAMIR et INSEE n’est pas la même. DAMIR classe les populations par tranches de 10 ans, sauf pour les 0-20 ans et les plus de 80 ans, tandis que l’INSEE les classe</w:t>
-      </w:r>
-      <w:r>
-        <w:t>s</w:t>
-      </w:r>
-      <w:r>
-        <w:t xml:space="preserve"> plus finement : 0-2 ans, 3-5, 6-10, 11-17, 18-24, 25-39, 40-54, 55-65, 65-78 et 80+. Une interpolation linéaire a donc été calculée pour effectuer la correspondance entre INSEE et DAMIR.</w:t>
-      </w:r>
-    </w:p>
-    <w:p>
-      <w:pPr>
-        <w:jc w:val="both"/>
-      </w:pPr>
-    </w:p>
-    <w:p>
-      <w:pPr>
-        <w:jc w:val="both"/>
-      </w:pPr>
-      <w:r>
-        <w:rPr>
-          <w:b/>
-          <w:bCs/>
-        </w:rPr>
-        <w:t>Cas particulier des moins de 20 ans :</w:t>
-      </w:r>
-      <w:r>
-        <w:t xml:space="preserve"> DAM</w:t>
-      </w:r>
-      <w:r>
-        <w:t>IR</w:t>
-      </w:r>
-      <w:r>
-        <w:t xml:space="preserve"> n’a qu’une classe </w:t>
-      </w:r>
-      <w:r>
-        <w:t>d’âge</w:t>
-      </w:r>
-      <w:r>
-        <w:t xml:space="preserve"> pour les moins de 20 ans alors que l’INSEE est plus </w:t>
-      </w:r>
-      <w:r>
-        <w:t>fin</w:t>
-      </w:r>
-      <w:r>
-        <w:t xml:space="preserve"> avec 5 classes </w:t>
-      </w:r>
-      <w:r>
-        <w:t>d’âge</w:t>
-      </w:r>
-      <w:r>
-        <w:t xml:space="preserve">. La répartition a été faite </w:t>
-      </w:r>
-      <w:r>
-        <w:t xml:space="preserve">linéairement </w:t>
-      </w:r>
-      <w:r>
-        <w:t>comme suit :</w:t>
-      </w:r>
-    </w:p>
-    <w:p>
-      <w:pPr>
-        <w:pStyle w:val="Paragraphedeliste"/>
-        <w:numPr>
-          <w:ilvl w:val="0"/>
-          <w:numId w:val="27"/>
-        </w:numPr>
-        <w:spacing w:line="256" w:lineRule="auto"/>
-        <w:jc w:val="both"/>
-        <w:rPr>
-          <w:rFonts w:eastAsia="Times New Roman"/>
-          <w:kern w:val="0"/>
-          <w14:ligatures w14:val="none"/>
-        </w:rPr>
-      </w:pPr>
-      <w:r>
-        <w:rPr>
-          <w:rFonts w:eastAsia="Times New Roman"/>
-        </w:rPr>
-        <w:t>3/20</w:t>
-      </w:r>
-      <w:r>
-        <w:rPr>
-          <w:rFonts w:eastAsia="Times New Roman"/>
-          <w:vertAlign w:val="superscript"/>
-        </w:rPr>
-        <w:t>e</w:t>
-      </w:r>
-      <w:r>
-        <w:rPr>
-          <w:rFonts w:eastAsia="Times New Roman"/>
-        </w:rPr>
-        <w:t xml:space="preserve"> des données de la classe d’âge 0-20 ans (DAMIR) ont été affectées à la classe d’âge 0-2 ans (INSEE), sauf pour les pédiatres</w:t>
-      </w:r>
-      <w:r>
-        <w:rPr>
-          <w:rFonts w:eastAsia="Times New Roman"/>
-        </w:rPr>
-        <w:t xml:space="preserve"> </w:t>
-      </w:r>
-      <w:r>
-        <w:rPr>
-          <w:rFonts w:eastAsia="Times New Roman"/>
-        </w:rPr>
-        <w:t>: 6/20</w:t>
-      </w:r>
-      <w:r>
-        <w:rPr>
-          <w:rFonts w:eastAsia="Times New Roman"/>
-          <w:vertAlign w:val="superscript"/>
-        </w:rPr>
-        <w:t>e</w:t>
-      </w:r>
-    </w:p>
-    <w:p>
-      <w:pPr>
-        <w:pStyle w:val="Paragraphedeliste"/>
-        <w:numPr>
-          <w:ilvl w:val="0"/>
-          <w:numId w:val="27"/>
-        </w:numPr>
-        <w:spacing w:line="256" w:lineRule="auto"/>
-        <w:jc w:val="both"/>
-        <w:rPr>
-          <w:rFonts w:eastAsia="Times New Roman"/>
-          <w:kern w:val="0"/>
-          <w14:ligatures w14:val="none"/>
-        </w:rPr>
-      </w:pPr>
-      <w:r>
-        <w:rPr>
-          <w:rFonts w:eastAsia="Times New Roman"/>
-        </w:rPr>
-        <w:t>3/20</w:t>
-      </w:r>
-      <w:r>
-        <w:rPr>
-          <w:rFonts w:eastAsia="Times New Roman"/>
-          <w:vertAlign w:val="superscript"/>
-        </w:rPr>
-        <w:t>e</w:t>
-      </w:r>
-      <w:r>
-        <w:rPr>
-          <w:rFonts w:eastAsia="Times New Roman"/>
-        </w:rPr>
-        <w:t xml:space="preserve"> affectées à la classe d’âge 3-5</w:t>
-      </w:r>
-    </w:p>
-    <w:p>
-      <w:pPr>
-        <w:pStyle w:val="Paragraphedeliste"/>
-        <w:numPr>
-          <w:ilvl w:val="0"/>
-          <w:numId w:val="27"/>
-        </w:numPr>
-        <w:spacing w:line="256" w:lineRule="auto"/>
-        <w:jc w:val="both"/>
-        <w:rPr>
-          <w:rFonts w:eastAsia="Times New Roman"/>
-          <w:kern w:val="0"/>
-          <w14:ligatures w14:val="none"/>
-        </w:rPr>
-      </w:pPr>
-      <w:r>
-        <w:rPr>
-          <w:rFonts w:eastAsia="Times New Roman"/>
-        </w:rPr>
-        <w:t>5/20</w:t>
-      </w:r>
-      <w:r>
-        <w:rPr>
-          <w:rFonts w:eastAsia="Times New Roman"/>
-          <w:vertAlign w:val="superscript"/>
-        </w:rPr>
-        <w:t>e</w:t>
-      </w:r>
-      <w:r>
-        <w:rPr>
-          <w:rFonts w:eastAsia="Times New Roman"/>
-        </w:rPr>
-        <w:t xml:space="preserve"> affectées à la classe d’âge 6-10, sauf pour les pédiatres : 4/20</w:t>
-      </w:r>
-      <w:r>
-        <w:rPr>
-          <w:rFonts w:eastAsia="Times New Roman"/>
-          <w:vertAlign w:val="superscript"/>
-        </w:rPr>
-        <w:t>e</w:t>
-      </w:r>
-    </w:p>
-    <w:p>
-      <w:pPr>
-        <w:pStyle w:val="Paragraphedeliste"/>
-        <w:numPr>
-          <w:ilvl w:val="0"/>
-          <w:numId w:val="27"/>
-        </w:numPr>
-        <w:spacing w:line="256" w:lineRule="auto"/>
-        <w:jc w:val="both"/>
-        <w:rPr>
-          <w:rFonts w:eastAsia="Times New Roman"/>
-          <w:kern w:val="0"/>
-          <w14:ligatures w14:val="none"/>
-        </w:rPr>
-      </w:pPr>
-      <w:r>
-        <w:rPr>
-          <w:rFonts w:eastAsia="Times New Roman"/>
-        </w:rPr>
-        <w:t>7/20</w:t>
-      </w:r>
-      <w:r>
-        <w:rPr>
-          <w:rFonts w:eastAsia="Times New Roman"/>
-          <w:vertAlign w:val="superscript"/>
-        </w:rPr>
-        <w:t>e</w:t>
-      </w:r>
-      <w:r>
-        <w:rPr>
-          <w:rFonts w:eastAsia="Times New Roman"/>
-        </w:rPr>
-        <w:t xml:space="preserve"> affectées à la classe d’âge 11-17, sauf pour les pédiatres : 5/20</w:t>
-      </w:r>
-      <w:r>
-        <w:rPr>
-          <w:rFonts w:eastAsia="Times New Roman"/>
-          <w:vertAlign w:val="superscript"/>
-        </w:rPr>
-        <w:t>e</w:t>
-      </w:r>
-    </w:p>
-    <w:p>
-      <w:pPr>
-        <w:pStyle w:val="Paragraphedeliste"/>
-        <w:numPr>
-          <w:ilvl w:val="0"/>
-          <w:numId w:val="27"/>
-        </w:numPr>
-        <w:spacing w:line="256" w:lineRule="auto"/>
-        <w:jc w:val="both"/>
-        <w:rPr>
-          <w:rFonts w:eastAsia="Times New Roman"/>
-          <w:kern w:val="0"/>
-          <w14:ligatures w14:val="none"/>
-        </w:rPr>
-      </w:pPr>
-      <w:r>
-        <w:rPr>
-          <w:rFonts w:eastAsia="Times New Roman"/>
-        </w:rPr>
-        <w:t>2/20</w:t>
-      </w:r>
-      <w:r>
-        <w:rPr>
-          <w:rFonts w:eastAsia="Times New Roman"/>
-          <w:vertAlign w:val="superscript"/>
-        </w:rPr>
-        <w:t>e</w:t>
-      </w:r>
-      <w:r>
-        <w:rPr>
-          <w:rFonts w:eastAsia="Times New Roman"/>
-        </w:rPr>
-        <w:t xml:space="preserve"> affectées à la classe d’âge 18-24, sauf pour les pédiatres : 1/20</w:t>
-      </w:r>
-      <w:r>
-        <w:rPr>
-          <w:rFonts w:eastAsia="Times New Roman"/>
-          <w:vertAlign w:val="superscript"/>
-        </w:rPr>
-        <w:t>e</w:t>
-      </w:r>
-    </w:p>
-    <w:p>
-      <w:pPr>
-        <w:jc w:val="both"/>
-      </w:pPr>
-    </w:p>
-    <w:p>
-      <w:pPr>
-        <w:jc w:val="both"/>
-      </w:pPr>
-      <w:r>
-        <w:rPr>
-          <w:b/>
-          <w:bCs/>
-        </w:rPr>
-        <w:t>Cas particulier</w:t>
-      </w:r>
-      <w:r>
-        <w:rPr>
-          <w:b/>
-          <w:bCs/>
-        </w:rPr>
-        <w:t xml:space="preserve"> des </w:t>
-      </w:r>
-      <w:r>
-        <w:rPr>
-          <w:b/>
-          <w:bCs/>
-        </w:rPr>
-        <w:t>gynécologues</w:t>
-      </w:r>
-      <w:r>
-        <w:rPr>
-          <w:b/>
-          <w:bCs/>
-        </w:rPr>
-        <w:t xml:space="preserve"> et des sage-femmes</w:t>
-      </w:r>
-      <w:r>
-        <w:t xml:space="preserve"> :</w:t>
-      </w:r>
-      <w:r>
-        <w:t xml:space="preserve"> seule la population de</w:t>
-      </w:r>
-      <w:r>
-        <w:t>s</w:t>
-      </w:r>
-      <w:r>
-        <w:t xml:space="preserve"> femme</w:t>
-      </w:r>
-      <w:r>
-        <w:t>s</w:t>
-      </w:r>
-      <w:r>
-        <w:t xml:space="preserve"> est pris</w:t>
-      </w:r>
-      <w:r>
-        <w:t>e</w:t>
-      </w:r>
-      <w:r>
-        <w:t xml:space="preserve"> en compte</w:t>
-      </w:r>
-      <w:r>
-        <w:t>.</w:t>
-      </w:r>
-    </w:p>
-    <w:p>
-      <w:pPr>
-        <w:jc w:val="both"/>
-      </w:pPr>
-      <w:commentRangeStart w:id="7"/>
-      <w:r>
-        <w:rPr>
-          <w:b/>
-          <w:bCs/>
-        </w:rPr>
-        <w:t>Cas particulier des pédiatres</w:t>
-      </w:r>
-      <w:r>
-        <w:t xml:space="preserve"> : seule la population de </w:t>
-      </w:r>
-      <w:r>
-        <w:t>moins de 1</w:t>
-      </w:r>
-      <w:r>
-        <w:t>7</w:t>
-      </w:r>
-      <w:r>
-        <w:t xml:space="preserve"> ans est prise en compte.</w:t>
-      </w:r>
-      <w:commentRangeEnd w:id="7"/>
-      <w:r>
-        <w:rPr>
-          <w:rStyle w:val="Marquedecommentaire"/>
-          <w:sz w:val="22"/>
-          <w:szCs w:val="22"/>
-        </w:rPr>
-        <w:commentReference w:id="7"/>
-      </w:r>
     </w:p>
     <w:p/>
     <w:p>
@@ -7683,7 +8082,7 @@
                     <pic:cNvPicPr/>
                   </pic:nvPicPr>
                   <pic:blipFill>
-                    <a:blip r:embed="rId29"/>
+                    <a:blip r:embed="rId32"/>
                     <a:stretch>
                       <a:fillRect/>
                     </a:stretch>
@@ -7855,7 +8254,7 @@
                     <pic:cNvPicPr/>
                   </pic:nvPicPr>
                   <pic:blipFill>
-                    <a:blip r:embed="rId30"/>
+                    <a:blip r:embed="rId33"/>
                     <a:stretch>
                       <a:fillRect/>
                     </a:stretch>
@@ -8027,7 +8426,7 @@
                     <pic:cNvPicPr/>
                   </pic:nvPicPr>
                   <pic:blipFill>
-                    <a:blip r:embed="rId31"/>
+                    <a:blip r:embed="rId34"/>
                     <a:stretch>
                       <a:fillRect/>
                     </a:stretch>
@@ -8273,11 +8672,12 @@
         <w:lastRenderedPageBreak/>
         <w:t xml:space="preserve">« concurrence » </w:t>
       </w:r>
-      <w:commentRangeStart w:id="8"/>
-      <w:r>
-        <w:t>potentiel entre communes et IRIS : l’offre de soins d’un professionnel de santé peut être partagée entre différentes communes et IRIS.</w:t>
-      </w:r>
-      <w:commentRangeEnd w:id="8"/>
+      <w:commentRangeStart w:id="12"/>
+      <w:commentRangeStart w:id="13"/>
+      <w:r>
+        <w:t>potentiel entre IRIS : l’offre de soins d’un professionnel de santé peut être partagée entre différentes IRIS.</w:t>
+      </w:r>
+      <w:commentRangeEnd w:id="12"/>
       <w:r>
         <w:rPr>
           <w:rStyle w:val="Marquedecommentaire"/>
@@ -8286,11 +8686,21 @@
           <w:szCs w:val="22"/>
           <w14:ligatures w14:val="none"/>
         </w:rPr>
-        <w:commentReference w:id="8"/>
+        <w:commentReference w:id="12"/>
+      </w:r>
+      <w:commentRangeEnd w:id="13"/>
+      <w:r>
+        <w:rPr>
+          <w:rStyle w:val="Marquedecommentaire"/>
+          <w:kern w:val="0"/>
+          <w:sz w:val="22"/>
+          <w:szCs w:val="22"/>
+          <w14:ligatures w14:val="none"/>
+        </w:rPr>
+        <w:commentReference w:id="13"/>
       </w:r>
     </w:p>
     <w:p/>
-    <w:p/>
     <w:p>
       <w:pPr>
         <w:jc w:val="both"/>
@@ -8298,178 +8708,225 @@
       <w:r>
         <w:t xml:space="preserve">La méthode du 2SFCA a été initialement proposée par </w:t>
       </w:r>
-      <w:commentRangeStart w:id="9"/>
-      <w:r>
-        <w:t xml:space="preserve">Radke et Mu (2000) puis développée par Luo et Wang (2003a et b, 2005). </w:t>
-      </w:r>
-      <w:commentRangeEnd w:id="9"/>
+      <w:commentRangeStart w:id="14"/>
+      <w:commentRangeStart w:id="15"/>
+      <w:r>
+        <w:t>Radke et Mu (2000)</w:t>
+      </w:r>
+      <w:r>
+        <w:rPr>
+          <w:rStyle w:val="Appelnotedebasdep"/>
+        </w:rPr>
+        <w:t xml:space="preserve"> </w:t>
+      </w:r>
+      <w:r>
+        <w:rPr>
+          <w:rStyle w:val="Appelnotedebasdep"/>
+        </w:rPr>
+        <w:footnoteReference w:id="1"/>
+      </w:r>
+      <w:r>
+        <w:t xml:space="preserve"> puis développée par Luo et Wang (2003a et b, 2005)</w:t>
+      </w:r>
+      <w:r>
+        <w:rPr>
+          <w:rStyle w:val="Appelnotedebasdep"/>
+        </w:rPr>
+        <w:footnoteReference w:id="2"/>
+      </w:r>
+      <w:r>
+        <w:t xml:space="preserve">. </w:t>
+      </w:r>
+      <w:commentRangeEnd w:id="14"/>
       <w:r>
         <w:rPr>
           <w:rStyle w:val="Marquedecommentaire"/>
           <w:sz w:val="22"/>
           <w:szCs w:val="22"/>
         </w:rPr>
-        <w:commentReference w:id="9"/>
-      </w:r>
-      <w:r>
-        <w:t>Les auteurs ont démontré qu’il s’agissait d’un cas particulier de modèle gravitaire.</w:t>
-      </w:r>
-      <w:r>
-        <w:t xml:space="preserve"> Nous adaptons ici ce modèle à un niveau infra-communal. </w:t>
-      </w:r>
-    </w:p>
-    <w:p>
-      <w:pPr>
-        <w:jc w:val="both"/>
-      </w:pPr>
-    </w:p>
-    <w:p>
-      <w:pPr>
-        <w:jc w:val="both"/>
-      </w:pPr>
-      <w:r>
-        <w:t xml:space="preserve">Le 2SFCA se lit comme une densité de professionnels </w:t>
-      </w:r>
-      <w:commentRangeStart w:id="10"/>
-      <w:r>
-        <w:t xml:space="preserve">par commune </w:t>
-      </w:r>
-      <w:commentRangeEnd w:id="10"/>
+        <w:commentReference w:id="14"/>
+      </w:r>
+      <w:commentRangeEnd w:id="15"/>
       <w:r>
         <w:rPr>
           <w:rStyle w:val="Marquedecommentaire"/>
           <w:sz w:val="22"/>
           <w:szCs w:val="22"/>
         </w:rPr>
-        <w:commentReference w:id="10"/>
-      </w:r>
-      <w:r>
-        <w:t>et tient compte de l’offre de professionnels et de la demande des patients des IRIS voisins. En ce sens, il ne souffre pas des principales critiques qui peuvent être faites aux indicateurs de densité et de distance. Le fait que la valeur de l’indicateur puisse être lue comme une densité de professionnels le rend facilement utilisable par les acteurs.</w:t>
-      </w:r>
-    </w:p>
-    <w:p>
-      <w:pPr>
-        <w:jc w:val="both"/>
-      </w:pPr>
-      <w:commentRangeStart w:id="11"/>
-      <w:r>
-        <w:t>La méthode du 2SFCA repose sur la construction de « secteurs flottants », et non de zonages préétablis, pour calculer des densités de professionnels. À chaque IRIS est associé un secteur flottant, qui se définit comme une courbe isochrone centrée sur l’IRIS étudié.</w:t>
-      </w:r>
-      <w:commentRangeEnd w:id="11"/>
+        <w:commentReference w:id="15"/>
+      </w:r>
+      <w:r>
+        <w:t>Les auteurs ont démontré qu’il s’agissait d’un cas particulier de modèle gravitaire.</w:t>
+      </w:r>
+      <w:r>
+        <w:t xml:space="preserve"> Nous adaptons ici ce modèle à un niveau infra-communal. </w:t>
+      </w:r>
+    </w:p>
+    <w:p>
+      <w:pPr>
+        <w:jc w:val="both"/>
+      </w:pPr>
+    </w:p>
+    <w:p>
+      <w:pPr>
+        <w:jc w:val="both"/>
+      </w:pPr>
+      <w:r>
+        <w:t xml:space="preserve">Le 2SFCA se lit comme une densité de professionnels </w:t>
+      </w:r>
+      <w:commentRangeStart w:id="16"/>
+      <w:commentRangeStart w:id="17"/>
+      <w:r>
+        <w:t xml:space="preserve">par </w:t>
+      </w:r>
+      <w:r>
+        <w:t>IRIS</w:t>
+      </w:r>
+      <w:r>
+        <w:t xml:space="preserve"> </w:t>
+      </w:r>
+      <w:commentRangeEnd w:id="16"/>
       <w:r>
         <w:rPr>
           <w:rStyle w:val="Marquedecommentaire"/>
           <w:sz w:val="22"/>
           <w:szCs w:val="22"/>
         </w:rPr>
-        <w:commentReference w:id="11"/>
-      </w:r>
-    </w:p>
-    <w:p>
-      <w:pPr>
-        <w:jc w:val="both"/>
-      </w:pPr>
-    </w:p>
-    <w:p>
-      <w:pPr>
-        <w:jc w:val="both"/>
-      </w:pPr>
-      <w:r>
-        <w:rPr>
-          <w:b/>
-          <w:bCs/>
-        </w:rPr>
-        <w:t>Étape 1</w:t>
-      </w:r>
-      <w:r>
-        <w:t xml:space="preserve"> : depuis chaque point d'offre (</w:t>
-      </w:r>
-      <w:r>
-        <w:t>l’offre de soins)</w:t>
-      </w:r>
-      <w:r>
-        <w:t>, on délimite une zone de chalandise et on calcule un ratio offre/demande</w:t>
-      </w:r>
-      <w:r>
-        <w:t>,</w:t>
-      </w:r>
-      <w:r>
-        <w:t xml:space="preserve"> c’est à dire</w:t>
-      </w:r>
-      <w:r>
-        <w:t xml:space="preserve"> </w:t>
-      </w:r>
-      <w:r>
-        <w:t>combien de patients potentiels pour chaque unité de soins disponible.</w:t>
-      </w:r>
-    </w:p>
-    <w:p>
-      <w:pPr>
-        <w:jc w:val="both"/>
-      </w:pPr>
-    </w:p>
-    <w:p>
-      <w:pPr>
-        <w:jc w:val="both"/>
-      </w:pPr>
-      <w:r>
-        <w:rPr>
-          <w:b/>
-          <w:bCs/>
-        </w:rPr>
-        <w:t>Étape 2</w:t>
-      </w:r>
-      <w:r>
-        <w:t xml:space="preserve"> : depuis chaque patient</w:t>
-      </w:r>
-      <w:r>
-        <w:t xml:space="preserve"> (ici centroïde d’un IRIS)</w:t>
-      </w:r>
-      <w:r>
-        <w:t xml:space="preserve">, on délimite sa zone d'accessibilité et on additionne tous les ratios des points d'offre accessibles. </w:t>
-      </w:r>
-      <w:commentRangeStart w:id="12"/>
-      <w:r>
-        <w:t>C'est ce total qui donne son score d'accessibilité.</w:t>
-      </w:r>
-      <w:commentRangeEnd w:id="12"/>
+        <w:commentReference w:id="16"/>
+      </w:r>
+      <w:commentRangeEnd w:id="17"/>
       <w:r>
         <w:rPr>
           <w:rStyle w:val="Marquedecommentaire"/>
           <w:sz w:val="22"/>
           <w:szCs w:val="22"/>
         </w:rPr>
-        <w:commentReference w:id="12"/>
-      </w:r>
-    </w:p>
-    <w:p>
-      <w:pPr>
-        <w:jc w:val="both"/>
-      </w:pPr>
-    </w:p>
-    <w:p>
-      <w:pPr>
-        <w:jc w:val="both"/>
-        <w:rPr>
-          <w:kern w:val="0"/>
-          <w14:ligatures w14:val="none"/>
-        </w:rPr>
-      </w:pPr>
-      <w:r>
-        <w:t xml:space="preserve">Les courbes isochrones seront définies par un temps de trajet et non par une </w:t>
-      </w:r>
-      <w:commentRangeStart w:id="13"/>
-      <w:r>
-        <w:t>distance</w:t>
-      </w:r>
-      <w:commentRangeEnd w:id="13"/>
+        <w:commentReference w:id="17"/>
+      </w:r>
+      <w:r>
+        <w:t>et tient compte de l’offre de professionnels et de la demande des patients des IRIS voisins. En ce sens, il ne souffre pas des principales critiques qui peuvent être faites aux indicateurs de densité et de distance. Le fait que la valeur de l’indicateur puisse être lue comme une densité de professionnels le rend facilement utilisable par les acteurs.</w:t>
+      </w:r>
+    </w:p>
+    <w:p>
+      <w:pPr>
+        <w:jc w:val="both"/>
+      </w:pPr>
+      <w:commentRangeStart w:id="18"/>
+      <w:commentRangeStart w:id="19"/>
+      <w:r>
+        <w:t>La méthode du 2SFCA repose sur la construction de « secteurs flottants », et non de zonages préétablis, pour calculer des densités de professionnels. À chaque IRIS est associé un secteur flottant, qui se définit comme une courbe isochrone centrée sur l’IRIS étudié.</w:t>
+      </w:r>
+      <w:commentRangeEnd w:id="18"/>
       <w:r>
         <w:rPr>
           <w:rStyle w:val="Marquedecommentaire"/>
           <w:sz w:val="22"/>
           <w:szCs w:val="22"/>
         </w:rPr>
-        <w:commentReference w:id="13"/>
+        <w:commentReference w:id="18"/>
+      </w:r>
+      <w:commentRangeEnd w:id="19"/>
+      <w:r>
+        <w:rPr>
+          <w:rStyle w:val="Marquedecommentaire"/>
+          <w:sz w:val="22"/>
+          <w:szCs w:val="22"/>
+        </w:rPr>
+        <w:commentReference w:id="19"/>
+      </w:r>
+    </w:p>
+    <w:p>
+      <w:pPr>
+        <w:jc w:val="both"/>
+      </w:pPr>
+    </w:p>
+    <w:p>
+      <w:pPr>
+        <w:jc w:val="both"/>
+      </w:pPr>
+      <w:r>
+        <w:rPr>
+          <w:b/>
+          <w:bCs/>
+        </w:rPr>
+        <w:t>Étape 1</w:t>
+      </w:r>
+      <w:r>
+        <w:t xml:space="preserve"> : depuis chaque point d'offre (</w:t>
+      </w:r>
+      <w:r>
+        <w:t>l’offre de soins)</w:t>
+      </w:r>
+      <w:r>
+        <w:t>, on délimite une zone de chalandise et on calcule un ratio offre/demande</w:t>
+      </w:r>
+      <w:r>
+        <w:t>,</w:t>
+      </w:r>
+      <w:r>
+        <w:t xml:space="preserve"> c’est à dire</w:t>
+      </w:r>
+      <w:r>
+        <w:t xml:space="preserve"> </w:t>
+      </w:r>
+      <w:r>
+        <w:t>combien de patients potentiels pour chaque unité de soins disponible.</w:t>
+      </w:r>
+    </w:p>
+    <w:p>
+      <w:pPr>
+        <w:jc w:val="both"/>
+      </w:pPr>
+    </w:p>
+    <w:p>
+      <w:pPr>
+        <w:jc w:val="both"/>
+      </w:pPr>
+      <w:r>
+        <w:rPr>
+          <w:b/>
+          <w:bCs/>
+        </w:rPr>
+        <w:t>Étape 2</w:t>
+      </w:r>
+      <w:r>
+        <w:t xml:space="preserve"> : depuis chaque patient</w:t>
+      </w:r>
+      <w:r>
+        <w:t xml:space="preserve"> (ici centroïde d’un IRIS)</w:t>
+      </w:r>
+      <w:r>
+        <w:t>, on délimite sa zone d'accessibilité et on additionne tous les ratios des points d'offre accessibles.</w:t>
+      </w:r>
+    </w:p>
+    <w:p>
+      <w:pPr>
+        <w:jc w:val="both"/>
+      </w:pPr>
+    </w:p>
+    <w:p>
+      <w:pPr>
+        <w:jc w:val="both"/>
+        <w:rPr>
+          <w:kern w:val="0"/>
+          <w14:ligatures w14:val="none"/>
+        </w:rPr>
+      </w:pPr>
+      <w:r>
+        <w:t xml:space="preserve">Les courbes isochrones seront définies par un temps de trajet et non par une </w:t>
+      </w:r>
+      <w:commentRangeStart w:id="20"/>
+      <w:r>
+        <w:t>distance</w:t>
+      </w:r>
+      <w:commentRangeEnd w:id="20"/>
+      <w:r>
+        <w:rPr>
+          <w:rStyle w:val="Marquedecommentaire"/>
+          <w:sz w:val="22"/>
+          <w:szCs w:val="22"/>
+        </w:rPr>
+        <w:commentReference w:id="20"/>
       </w:r>
       <w:r>
         <w:t>.</w:t>
@@ -8489,22 +8946,28 @@
           <w:szCs w:val="28"/>
         </w:rPr>
       </w:pPr>
-      <w:commentRangeStart w:id="14"/>
-      <w:commentRangeStart w:id="15"/>
-      <w:commentRangeStart w:id="16"/>
-      <w:r>
+    </w:p>
+    <w:p>
+      <w:pPr>
+        <w:jc w:val="center"/>
         <w:rPr>
           <w:rFonts w:ascii="Times New Roman" w:hAnsi="Times New Roman" w:cs="Times New Roman"/>
-          <w:noProof/>
           <w:sz w:val="28"/>
           <w:szCs w:val="28"/>
         </w:rPr>
+      </w:pPr>
+    </w:p>
+    <w:p>
+      <w:pPr>
+        <w:jc w:val="both"/>
+      </w:pPr>
+      <w:r>
         <w:lastRenderedPageBreak/>
         <w:drawing>
-          <wp:inline distT="0" distB="0" distL="0" distR="0" wp14:anchorId="4DDCA310" wp14:editId="5F629FD6">
+          <wp:inline distT="0" distB="0" distL="0" distR="0" wp14:anchorId="12421021" wp14:editId="06523A40">
             <wp:extent cx="5760720" cy="4745355"/>
             <wp:effectExtent l="0" t="0" r="0" b="0"/>
-            <wp:docPr id="757349083" name="Graphique 1"/>
+            <wp:docPr id="4222852" name="Graphique 1"/>
             <wp:cNvGraphicFramePr>
               <a:graphicFrameLocks xmlns:a="http://schemas.openxmlformats.org/drawingml/2006/main" noChangeAspect="1"/>
             </wp:cNvGraphicFramePr>
@@ -8512,14 +8975,14 @@
               <a:graphicData uri="http://schemas.openxmlformats.org/drawingml/2006/picture">
                 <pic:pic xmlns:pic="http://schemas.openxmlformats.org/drawingml/2006/picture">
                   <pic:nvPicPr>
-                    <pic:cNvPr id="757349083" name=""/>
+                    <pic:cNvPr id="4222852" name=""/>
                     <pic:cNvPicPr/>
                   </pic:nvPicPr>
                   <pic:blipFill>
-                    <a:blip r:embed="rId32">
+                    <a:blip r:embed="rId35">
                       <a:extLst>
                         <a:ext uri="{96DAC541-7B7A-43D3-8B79-37D633B846F1}">
-                          <asvg:svgBlip xmlns:asvg="http://schemas.microsoft.com/office/drawing/2016/SVG/main" r:embed="rId33"/>
+                          <asvg:svgBlip xmlns:asvg="http://schemas.microsoft.com/office/drawing/2016/SVG/main" r:embed="rId36"/>
                         </a:ext>
                       </a:extLst>
                     </a:blip>
@@ -8542,41 +9005,6 @@
           </wp:inline>
         </w:drawing>
       </w:r>
-      <w:commentRangeEnd w:id="16"/>
-      <w:r>
-        <w:rPr>
-          <w:rStyle w:val="Marquedecommentaire"/>
-          <w:rFonts w:ascii="Times New Roman" w:hAnsi="Times New Roman" w:cs="Times New Roman"/>
-          <w:sz w:val="28"/>
-          <w:szCs w:val="28"/>
-        </w:rPr>
-        <w:commentReference w:id="16"/>
-      </w:r>
-      <w:commentRangeEnd w:id="15"/>
-      <w:r>
-        <w:rPr>
-          <w:rStyle w:val="Marquedecommentaire"/>
-          <w:rFonts w:ascii="Times New Roman" w:hAnsi="Times New Roman" w:cs="Times New Roman"/>
-          <w:sz w:val="28"/>
-          <w:szCs w:val="28"/>
-        </w:rPr>
-        <w:commentReference w:id="15"/>
-      </w:r>
-      <w:commentRangeEnd w:id="14"/>
-      <w:r>
-        <w:rPr>
-          <w:rStyle w:val="Marquedecommentaire"/>
-          <w:rFonts w:ascii="Times New Roman" w:hAnsi="Times New Roman" w:cs="Times New Roman"/>
-          <w:sz w:val="28"/>
-          <w:szCs w:val="28"/>
-        </w:rPr>
-        <w:commentReference w:id="14"/>
-      </w:r>
-    </w:p>
-    <w:p>
-      <w:pPr>
-        <w:jc w:val="both"/>
-      </w:pPr>
     </w:p>
     <w:p/>
     <w:p>
@@ -9521,6 +9949,7 @@
         </w:numPr>
       </w:pPr>
       <w:r>
+        <w:lastRenderedPageBreak/>
         <w:t xml:space="preserve">Zone de recours </w:t>
       </w:r>
       <w:r>
@@ -9535,35 +9964,34 @@
       <w:pPr>
         <w:jc w:val="both"/>
       </w:pPr>
-      <w:commentRangeStart w:id="17"/>
-      <w:r>
-        <w:t xml:space="preserve">Dans un second temps, on définit pour chaque </w:t>
-      </w:r>
-      <w:commentRangeStart w:id="18"/>
-      <w:commentRangeStart w:id="19"/>
-      <w:r>
-        <w:t>commune</w:t>
-      </w:r>
-      <w:commentRangeEnd w:id="18"/>
-      <w:r>
-        <w:rPr>
-          <w:rStyle w:val="Marquedecommentaire"/>
-          <w:sz w:val="22"/>
-          <w:szCs w:val="22"/>
-        </w:rPr>
-        <w:commentReference w:id="18"/>
-      </w:r>
-      <w:commentRangeEnd w:id="19"/>
-      <w:r>
-        <w:rPr>
-          <w:rStyle w:val="Marquedecommentaire"/>
-          <w:sz w:val="22"/>
-          <w:szCs w:val="22"/>
-        </w:rPr>
-        <w:commentReference w:id="19"/>
-      </w:r>
-      <w:r>
-        <w:t xml:space="preserve"> i de population l’ensemble des IRIS </w:t>
+      <w:commentRangeStart w:id="21"/>
+      <w:commentRangeStart w:id="22"/>
+      <w:r>
+        <w:t xml:space="preserve">Dans un second temps, pour chaque </w:t>
+      </w:r>
+      <w:r>
+        <w:t>IRIS</w:t>
+      </w:r>
+      <w:r>
+        <w:t xml:space="preserve"> </w:t>
+      </w:r>
+      <w:r>
+        <w:rPr>
+          <w:i/>
+          <w:iCs/>
+          <w:sz w:val="28"/>
+          <w:szCs w:val="28"/>
+        </w:rPr>
+        <w:t>i</w:t>
+      </w:r>
+      <w:r>
+        <w:t xml:space="preserve"> </w:t>
+      </w:r>
+      <w:r>
+        <w:t xml:space="preserve">(côté demande), on identifie l’ensemble </w:t>
+      </w:r>
+      <w:r>
+        <w:t xml:space="preserve">IRIS </w:t>
       </w:r>
       <w:r>
         <w:rPr>
@@ -9576,7 +10004,16 @@
         <w:t>j</w:t>
       </w:r>
       <w:r>
-        <w:t xml:space="preserve"> de PS accessibles sous une durée </w:t>
+        <w:t xml:space="preserve"> </w:t>
+      </w:r>
+      <w:r>
+        <w:t xml:space="preserve">(côté offre) où se trouve des </w:t>
+      </w:r>
+      <w:r>
+        <w:t>PS accessibles</w:t>
+      </w:r>
+      <w:r>
+        <w:t xml:space="preserve"> en un temps de trajet inférieur au seuil </w:t>
       </w:r>
       <m:oMath>
         <m:sSub>
@@ -9615,7 +10052,10 @@
         <w:jc w:val="both"/>
       </w:pPr>
       <w:r>
-        <w:t xml:space="preserve">Puis on somme pour chaque IRIS </w:t>
+        <w:t>On additionne ensuite pour cet</w:t>
+      </w:r>
+      <w:r>
+        <w:t xml:space="preserve"> IRIS </w:t>
       </w:r>
       <w:r>
         <w:rPr>
@@ -9660,36 +10100,23 @@
         </m:sSub>
       </m:oMath>
       <w:r>
-        <w:t xml:space="preserve"> précédemment calculés pour les PS de spécialité s disponibles sous </w:t>
-      </w:r>
-      <m:oMath>
-        <m:sSub>
-          <m:sSubPr>
-            <m:ctrlPr>
-              <w:rPr>
-                <w:rFonts w:ascii="Cambria Math" w:hAnsi="Cambria Math"/>
-                <w:i/>
-              </w:rPr>
-            </m:ctrlPr>
-          </m:sSubPr>
-          <m:e>
-            <m:r>
-              <w:rPr>
-                <w:rFonts w:ascii="Cambria Math" w:hAnsi="Cambria Math"/>
-              </w:rPr>
-              <m:t>d</m:t>
-            </m:r>
-          </m:e>
-          <m:sub>
-            <m:r>
-              <w:rPr>
-                <w:rFonts w:ascii="Cambria Math" w:hAnsi="Cambria Math"/>
-              </w:rPr>
-              <m:t>0</m:t>
-            </m:r>
-          </m:sub>
-        </m:sSub>
-      </m:oMath>
+        <w:t xml:space="preserve"> calculés </w:t>
+      </w:r>
+      <w:r>
+        <w:t xml:space="preserve">à l’étape précédente </w:t>
+      </w:r>
+      <w:r>
+        <w:t>pour</w:t>
+      </w:r>
+      <w:r>
+        <w:t xml:space="preserve"> tous</w:t>
+      </w:r>
+      <w:r>
+        <w:t xml:space="preserve"> les PS de spécialité s </w:t>
+      </w:r>
+      <w:r>
+        <w:t>accessibles dans ce périmètre</w:t>
+      </w:r>
       <w:r>
         <w:t xml:space="preserve">. Le résultat ainsi obtenu représente l’accessibilité </w:t>
       </w:r>
@@ -9758,14 +10185,23 @@
         </w:rPr>
         <w:t>s</w:t>
       </w:r>
-      <w:commentRangeEnd w:id="17"/>
+      <w:commentRangeEnd w:id="21"/>
       <w:r>
         <w:rPr>
           <w:rStyle w:val="Marquedecommentaire"/>
           <w:sz w:val="22"/>
           <w:szCs w:val="22"/>
         </w:rPr>
-        <w:commentReference w:id="17"/>
+        <w:commentReference w:id="21"/>
+      </w:r>
+      <w:commentRangeEnd w:id="22"/>
+      <w:r>
+        <w:rPr>
+          <w:rStyle w:val="Marquedecommentaire"/>
+          <w:sz w:val="22"/>
+          <w:szCs w:val="22"/>
+        </w:rPr>
+        <w:commentReference w:id="22"/>
       </w:r>
       <w:r>
         <w:t> :</w:t>
@@ -10039,27 +10475,31 @@
         <w:t>Le graphique ci-dessous représente l’APL au niveau IRIS pour les généralistes en 2025.</w:t>
       </w:r>
     </w:p>
-    <w:p/>
-    <w:p>
-      <w:pPr>
-        <w:jc w:val="both"/>
-      </w:pPr>
-    </w:p>
-    <w:p>
-      <w:pPr>
-        <w:jc w:val="both"/>
-      </w:pPr>
-      <w:commentRangeStart w:id="20"/>
-      <w:r>
-        <w:rPr>
-          <w:noProof/>
-        </w:rPr>
-        <w:lastRenderedPageBreak/>
+    <w:p>
+      <w:pPr>
+        <w:jc w:val="both"/>
+      </w:pPr>
+    </w:p>
+    <w:p>
+      <w:pPr>
+        <w:jc w:val="both"/>
+      </w:pPr>
+    </w:p>
+    <w:p>
+      <w:pPr>
+        <w:rPr>
+          <w:lang w:val="en-US"/>
+        </w:rPr>
+      </w:pPr>
+      <w:r>
+        <w:rPr>
+          <w:lang w:val="en-US"/>
+        </w:rPr>
         <w:drawing>
-          <wp:inline distT="0" distB="0" distL="0" distR="0" wp14:anchorId="2F6409C5" wp14:editId="2BD7998B">
-            <wp:extent cx="5403215" cy="5340985"/>
-            <wp:effectExtent l="0" t="0" r="6985" b="0"/>
-            <wp:docPr id="1120455665" name="Image 1"/>
+          <wp:inline distT="0" distB="0" distL="0" distR="0" wp14:anchorId="3205C1D0" wp14:editId="5CE363DF">
+            <wp:extent cx="5760720" cy="4809490"/>
+            <wp:effectExtent l="0" t="0" r="0" b="0"/>
+            <wp:docPr id="229219910" name="Image 1"/>
             <wp:cNvGraphicFramePr>
               <a:graphicFrameLocks xmlns:a="http://schemas.openxmlformats.org/drawingml/2006/main" noChangeAspect="1"/>
             </wp:cNvGraphicFramePr>
@@ -10067,36 +10507,23 @@
               <a:graphicData uri="http://schemas.openxmlformats.org/drawingml/2006/picture">
                 <pic:pic xmlns:pic="http://schemas.openxmlformats.org/drawingml/2006/picture">
                   <pic:nvPicPr>
-                    <pic:cNvPr id="0" name="Picture 1"/>
-                    <pic:cNvPicPr>
-                      <a:picLocks noChangeAspect="1" noChangeArrowheads="1"/>
-                    </pic:cNvPicPr>
+                    <pic:cNvPr id="229219910" name=""/>
+                    <pic:cNvPicPr/>
                   </pic:nvPicPr>
                   <pic:blipFill>
-                    <a:blip r:embed="rId34">
-                      <a:extLst>
-                        <a:ext uri="{28A0092B-C50C-407E-A947-70E740481C1C}">
-                          <a14:useLocalDpi xmlns:a14="http://schemas.microsoft.com/office/drawing/2010/main" val="0"/>
-                        </a:ext>
-                      </a:extLst>
-                    </a:blip>
-                    <a:srcRect/>
+                    <a:blip r:embed="rId37"/>
                     <a:stretch>
                       <a:fillRect/>
                     </a:stretch>
                   </pic:blipFill>
-                  <pic:spPr bwMode="auto">
+                  <pic:spPr>
                     <a:xfrm>
                       <a:off x="0" y="0"/>
-                      <a:ext cx="5403215" cy="5340985"/>
+                      <a:ext cx="5760720" cy="4809490"/>
                     </a:xfrm>
                     <a:prstGeom prst="rect">
                       <a:avLst/>
                     </a:prstGeom>
-                    <a:noFill/>
-                    <a:ln>
-                      <a:noFill/>
-                    </a:ln>
                   </pic:spPr>
                 </pic:pic>
               </a:graphicData>
@@ -10104,29 +10531,18 @@
           </wp:inline>
         </w:drawing>
       </w:r>
-      <w:commentRangeEnd w:id="20"/>
-      <w:r>
-        <w:rPr>
-          <w:rStyle w:val="Marquedecommentaire"/>
-          <w:sz w:val="22"/>
-          <w:szCs w:val="22"/>
-        </w:rPr>
-        <w:commentReference w:id="20"/>
-      </w:r>
-    </w:p>
-    <w:p>
-      <w:pPr>
-        <w:rPr>
-          <w:lang w:val="en-US"/>
-        </w:rPr>
-      </w:pPr>
-    </w:p>
-    <w:p>
-      <w:pPr>
-        <w:rPr>
-          <w:lang w:val="en-US"/>
-        </w:rPr>
-      </w:pPr>
+    </w:p>
+    <w:p>
+      <w:r>
+        <w:lastRenderedPageBreak/>
+        <w:t>Nous pouvons voir on r</w:t>
+      </w:r>
+      <w:r>
+        <w:t xml:space="preserve">ouge les zones à forte APL et en bleu les zone à faible APL. Nous pouvons voir un fort APL autour des centres urbains et dans certaines zones touristiques et de fortes disparités dans le quart Sud Est de la </w:t>
+      </w:r>
+      <w:r>
+        <w:t>France.</w:t>
+      </w:r>
     </w:p>
     <w:p>
       <w:pPr>
@@ -10151,26 +10567,26 @@
       <w:r>
         <w:t xml:space="preserve">(cartographie des </w:t>
       </w:r>
-      <w:commentRangeStart w:id="21"/>
+      <w:commentRangeStart w:id="23"/>
       <w:r>
         <w:t>APL</w:t>
       </w:r>
-      <w:commentRangeEnd w:id="21"/>
+      <w:commentRangeEnd w:id="23"/>
       <w:r>
         <w:rPr>
           <w:rStyle w:val="Marquedecommentaire"/>
           <w:sz w:val="40"/>
           <w:szCs w:val="40"/>
         </w:rPr>
-        <w:commentReference w:id="21"/>
+        <w:commentReference w:id="23"/>
       </w:r>
       <w:r>
         <w:t>)</w:t>
       </w:r>
     </w:p>
     <w:p>
-      <w:commentRangeStart w:id="22"/>
-      <w:commentRangeStart w:id="23"/>
+      <w:commentRangeStart w:id="24"/>
+      <w:commentRangeStart w:id="25"/>
     </w:p>
     <w:p>
       <w:pPr>
@@ -10244,23 +10660,23 @@
       <w:r>
         <w:t>.</w:t>
       </w:r>
-      <w:commentRangeEnd w:id="22"/>
+      <w:commentRangeEnd w:id="24"/>
       <w:r>
         <w:rPr>
           <w:rStyle w:val="Marquedecommentaire"/>
           <w:sz w:val="22"/>
           <w:szCs w:val="22"/>
         </w:rPr>
-        <w:commentReference w:id="22"/>
-      </w:r>
-      <w:commentRangeEnd w:id="23"/>
+        <w:commentReference w:id="24"/>
+      </w:r>
+      <w:commentRangeEnd w:id="25"/>
       <w:r>
         <w:rPr>
           <w:rStyle w:val="Marquedecommentaire"/>
           <w:sz w:val="22"/>
           <w:szCs w:val="22"/>
         </w:rPr>
-        <w:commentReference w:id="23"/>
+        <w:commentReference w:id="25"/>
       </w:r>
     </w:p>
     <w:p>
@@ -10291,7 +10707,6 @@
           <w:b/>
           <w:bCs/>
         </w:rPr>
-        <w:lastRenderedPageBreak/>
         <w:t>Choix du périmètre administratif et des professionnels de santé</w:t>
       </w:r>
     </w:p>
@@ -10442,7 +10857,7 @@
                     <pic:cNvPicPr/>
                   </pic:nvPicPr>
                   <pic:blipFill>
-                    <a:blip r:embed="rId35"/>
+                    <a:blip r:embed="rId38"/>
                     <a:stretch>
                       <a:fillRect/>
                     </a:stretch>
@@ -10510,6 +10925,7 @@
           <w:sz w:val="28"/>
           <w:szCs w:val="28"/>
         </w:rPr>
+        <w:lastRenderedPageBreak/>
         <w:drawing>
           <wp:inline distT="0" distB="0" distL="0" distR="0" wp14:anchorId="181B4F03" wp14:editId="6AB2ED0B">
             <wp:extent cx="5760720" cy="1980565"/>
@@ -10526,7 +10942,7 @@
                     <pic:cNvPicPr/>
                   </pic:nvPicPr>
                   <pic:blipFill>
-                    <a:blip r:embed="rId36"/>
+                    <a:blip r:embed="rId39"/>
                     <a:stretch>
                       <a:fillRect/>
                     </a:stretch>
@@ -10691,7 +11107,6 @@
         <w:rPr>
           <w:noProof/>
         </w:rPr>
-        <w:lastRenderedPageBreak/>
         <w:drawing>
           <wp:inline distT="0" distB="0" distL="0" distR="0" wp14:anchorId="5A853B43" wp14:editId="60A09DA7">
             <wp:extent cx="5118340" cy="3311236"/>
@@ -10708,7 +11123,7 @@
                     <pic:cNvPicPr/>
                   </pic:nvPicPr>
                   <pic:blipFill>
-                    <a:blip r:embed="rId37"/>
+                    <a:blip r:embed="rId40"/>
                     <a:stretch>
                       <a:fillRect/>
                     </a:stretch>
@@ -10814,6 +11229,7 @@
         </w:rPr>
       </w:pPr>
       <w:r>
+        <w:lastRenderedPageBreak/>
         <w:t>L’échelle</w:t>
       </w:r>
       <w:r>
@@ -10848,7 +11264,6 @@
         <w:rPr>
           <w:noProof/>
         </w:rPr>
-        <w:lastRenderedPageBreak/>
         <w:drawing>
           <wp:inline distT="0" distB="0" distL="0" distR="0" wp14:anchorId="1A0600CC" wp14:editId="09071477">
             <wp:extent cx="5092988" cy="3645708"/>
@@ -10865,7 +11280,7 @@
                     <pic:cNvPicPr/>
                   </pic:nvPicPr>
                   <pic:blipFill>
-                    <a:blip r:embed="rId38"/>
+                    <a:blip r:embed="rId41"/>
                     <a:stretch>
                       <a:fillRect/>
                     </a:stretch>
@@ -11109,7 +11524,7 @@
                     <pic:cNvPicPr/>
                   </pic:nvPicPr>
                   <pic:blipFill>
-                    <a:blip r:embed="rId39"/>
+                    <a:blip r:embed="rId42"/>
                     <a:stretch>
                       <a:fillRect/>
                     </a:stretch>
@@ -11149,24 +11564,508 @@
       <w:r>
         <w:t xml:space="preserve"> </w:t>
       </w:r>
-      <w:commentRangeStart w:id="24"/>
+      <w:commentRangeStart w:id="26"/>
       <w:r>
         <w:t>GeoDataViz</w:t>
       </w:r>
-      <w:commentRangeEnd w:id="24"/>
+      <w:commentRangeEnd w:id="26"/>
       <w:r>
         <w:rPr>
           <w:rStyle w:val="Marquedecommentaire"/>
           <w:sz w:val="22"/>
           <w:szCs w:val="22"/>
         </w:rPr>
-        <w:commentReference w:id="24"/>
+        <w:commentReference w:id="26"/>
       </w:r>
     </w:p>
     <w:p/>
     <w:p>
       <w:r>
-        <w:t>TO DO</w:t>
+        <w:t>Une Toolbar est disponible pour paramétrer le DataViz</w:t>
+      </w:r>
+      <w:r>
+        <w:t>.</w:t>
+      </w:r>
+    </w:p>
+    <w:p/>
+    <w:p>
+      <w:r>
+        <w:drawing>
+          <wp:inline distT="0" distB="0" distL="0" distR="0" wp14:anchorId="04C35328" wp14:editId="5459CE37">
+            <wp:extent cx="3048425" cy="447737"/>
+            <wp:effectExtent l="0" t="0" r="0" b="9525"/>
+            <wp:docPr id="85004031" name="Image 1"/>
+            <wp:cNvGraphicFramePr>
+              <a:graphicFrameLocks xmlns:a="http://schemas.openxmlformats.org/drawingml/2006/main" noChangeAspect="1"/>
+            </wp:cNvGraphicFramePr>
+            <a:graphic xmlns:a="http://schemas.openxmlformats.org/drawingml/2006/main">
+              <a:graphicData uri="http://schemas.openxmlformats.org/drawingml/2006/picture">
+                <pic:pic xmlns:pic="http://schemas.openxmlformats.org/drawingml/2006/picture">
+                  <pic:nvPicPr>
+                    <pic:cNvPr id="85004031" name=""/>
+                    <pic:cNvPicPr/>
+                  </pic:nvPicPr>
+                  <pic:blipFill>
+                    <a:blip r:embed="rId43"/>
+                    <a:stretch>
+                      <a:fillRect/>
+                    </a:stretch>
+                  </pic:blipFill>
+                  <pic:spPr>
+                    <a:xfrm>
+                      <a:off x="0" y="0"/>
+                      <a:ext cx="3048425" cy="447737"/>
+                    </a:xfrm>
+                    <a:prstGeom prst="rect">
+                      <a:avLst/>
+                    </a:prstGeom>
+                  </pic:spPr>
+                </pic:pic>
+              </a:graphicData>
+            </a:graphic>
+          </wp:inline>
+        </w:drawing>
+      </w:r>
+    </w:p>
+    <w:p/>
+    <w:p>
+      <w:r>
+        <w:t xml:space="preserve">L’icône </w:t>
+      </w:r>
+      <w:r>
+        <w:drawing>
+          <wp:inline distT="0" distB="0" distL="0" distR="0" wp14:anchorId="7D456286" wp14:editId="69E1982D">
+            <wp:extent cx="285790" cy="247685"/>
+            <wp:effectExtent l="0" t="0" r="0" b="0"/>
+            <wp:docPr id="1395083982" name="Image 1"/>
+            <wp:cNvGraphicFramePr>
+              <a:graphicFrameLocks xmlns:a="http://schemas.openxmlformats.org/drawingml/2006/main" noChangeAspect="1"/>
+            </wp:cNvGraphicFramePr>
+            <a:graphic xmlns:a="http://schemas.openxmlformats.org/drawingml/2006/main">
+              <a:graphicData uri="http://schemas.openxmlformats.org/drawingml/2006/picture">
+                <pic:pic xmlns:pic="http://schemas.openxmlformats.org/drawingml/2006/picture">
+                  <pic:nvPicPr>
+                    <pic:cNvPr id="1395083982" name=""/>
+                    <pic:cNvPicPr/>
+                  </pic:nvPicPr>
+                  <pic:blipFill>
+                    <a:blip r:embed="rId44"/>
+                    <a:stretch>
+                      <a:fillRect/>
+                    </a:stretch>
+                  </pic:blipFill>
+                  <pic:spPr>
+                    <a:xfrm>
+                      <a:off x="0" y="0"/>
+                      <a:ext cx="285790" cy="247685"/>
+                    </a:xfrm>
+                    <a:prstGeom prst="rect">
+                      <a:avLst/>
+                    </a:prstGeom>
+                  </pic:spPr>
+                </pic:pic>
+              </a:graphicData>
+            </a:graphic>
+          </wp:inline>
+        </w:drawing>
+      </w:r>
+      <w:r>
+        <w:t xml:space="preserve"> permet de sauvegarder le dataviz dans différents formats comme JPG, PNG et SVG.</w:t>
+      </w:r>
+    </w:p>
+    <w:p>
+      <w:r>
+        <w:t xml:space="preserve">L’icône </w:t>
+      </w:r>
+      <w:r>
+        <w:drawing>
+          <wp:inline distT="0" distB="0" distL="0" distR="0" wp14:anchorId="1DF4CF14" wp14:editId="53B8F806">
+            <wp:extent cx="285790" cy="276264"/>
+            <wp:effectExtent l="0" t="0" r="0" b="9525"/>
+            <wp:docPr id="2045633559" name="Image 1"/>
+            <wp:cNvGraphicFramePr>
+              <a:graphicFrameLocks xmlns:a="http://schemas.openxmlformats.org/drawingml/2006/main" noChangeAspect="1"/>
+            </wp:cNvGraphicFramePr>
+            <a:graphic xmlns:a="http://schemas.openxmlformats.org/drawingml/2006/main">
+              <a:graphicData uri="http://schemas.openxmlformats.org/drawingml/2006/picture">
+                <pic:pic xmlns:pic="http://schemas.openxmlformats.org/drawingml/2006/picture">
+                  <pic:nvPicPr>
+                    <pic:cNvPr id="2045633559" name=""/>
+                    <pic:cNvPicPr/>
+                  </pic:nvPicPr>
+                  <pic:blipFill>
+                    <a:blip r:embed="rId45"/>
+                    <a:stretch>
+                      <a:fillRect/>
+                    </a:stretch>
+                  </pic:blipFill>
+                  <pic:spPr>
+                    <a:xfrm>
+                      <a:off x="0" y="0"/>
+                      <a:ext cx="285790" cy="276264"/>
+                    </a:xfrm>
+                    <a:prstGeom prst="rect">
+                      <a:avLst/>
+                    </a:prstGeom>
+                  </pic:spPr>
+                </pic:pic>
+              </a:graphicData>
+            </a:graphic>
+          </wp:inline>
+        </w:drawing>
+      </w:r>
+      <w:r>
+        <w:t xml:space="preserve"> permet de se déplacer dans le dataviz.</w:t>
+      </w:r>
+    </w:p>
+    <w:p>
+      <w:r>
+        <w:t xml:space="preserve">Les icônes </w:t>
+      </w:r>
+      <w:r>
+        <w:drawing>
+          <wp:inline distT="0" distB="0" distL="0" distR="0" wp14:anchorId="2BBDADE3" wp14:editId="26C4A121">
+            <wp:extent cx="657317" cy="304843"/>
+            <wp:effectExtent l="0" t="0" r="0" b="0"/>
+            <wp:docPr id="1351124420" name="Image 1"/>
+            <wp:cNvGraphicFramePr>
+              <a:graphicFrameLocks xmlns:a="http://schemas.openxmlformats.org/drawingml/2006/main" noChangeAspect="1"/>
+            </wp:cNvGraphicFramePr>
+            <a:graphic xmlns:a="http://schemas.openxmlformats.org/drawingml/2006/main">
+              <a:graphicData uri="http://schemas.openxmlformats.org/drawingml/2006/picture">
+                <pic:pic xmlns:pic="http://schemas.openxmlformats.org/drawingml/2006/picture">
+                  <pic:nvPicPr>
+                    <pic:cNvPr id="1351124420" name=""/>
+                    <pic:cNvPicPr/>
+                  </pic:nvPicPr>
+                  <pic:blipFill>
+                    <a:blip r:embed="rId46"/>
+                    <a:stretch>
+                      <a:fillRect/>
+                    </a:stretch>
+                  </pic:blipFill>
+                  <pic:spPr>
+                    <a:xfrm>
+                      <a:off x="0" y="0"/>
+                      <a:ext cx="657317" cy="304843"/>
+                    </a:xfrm>
+                    <a:prstGeom prst="rect">
+                      <a:avLst/>
+                    </a:prstGeom>
+                  </pic:spPr>
+                </pic:pic>
+              </a:graphicData>
+            </a:graphic>
+          </wp:inline>
+        </w:drawing>
+      </w:r>
+      <w:r>
+        <w:t xml:space="preserve"> permettent de zoomer et dézoomer dans le dataviz. Il est également possible</w:t>
+      </w:r>
+      <w:r>
+        <w:t xml:space="preserve"> d’utiliser la molette de la souris ou</w:t>
+      </w:r>
+      <w:r>
+        <w:t xml:space="preserve"> de </w:t>
+      </w:r>
+      <w:r>
+        <w:t>« pincer</w:t>
+      </w:r>
+      <w:r>
+        <w:t> » avec les doigts depuis une tablette ou un touchpad</w:t>
+      </w:r>
+      <w:r>
+        <w:t xml:space="preserve"> pour zoomer</w:t>
+      </w:r>
+      <w:r>
+        <w:t>.</w:t>
+      </w:r>
+    </w:p>
+    <w:p>
+      <w:r>
+        <w:t>L’icône</w:t>
+      </w:r>
+      <w:r>
+        <w:t xml:space="preserve"> </w:t>
+      </w:r>
+      <w:r>
+        <w:t xml:space="preserve"> </w:t>
+      </w:r>
+      <w:r>
+        <w:drawing>
+          <wp:inline distT="0" distB="0" distL="0" distR="0" wp14:anchorId="0CB3A5D2" wp14:editId="62ED2B73">
+            <wp:extent cx="400106" cy="304843"/>
+            <wp:effectExtent l="0" t="0" r="0" b="0"/>
+            <wp:docPr id="1148885611" name="Image 1"/>
+            <wp:cNvGraphicFramePr>
+              <a:graphicFrameLocks xmlns:a="http://schemas.openxmlformats.org/drawingml/2006/main" noChangeAspect="1"/>
+            </wp:cNvGraphicFramePr>
+            <a:graphic xmlns:a="http://schemas.openxmlformats.org/drawingml/2006/main">
+              <a:graphicData uri="http://schemas.openxmlformats.org/drawingml/2006/picture">
+                <pic:pic xmlns:pic="http://schemas.openxmlformats.org/drawingml/2006/picture">
+                  <pic:nvPicPr>
+                    <pic:cNvPr id="1148885611" name=""/>
+                    <pic:cNvPicPr/>
+                  </pic:nvPicPr>
+                  <pic:blipFill>
+                    <a:blip r:embed="rId47"/>
+                    <a:stretch>
+                      <a:fillRect/>
+                    </a:stretch>
+                  </pic:blipFill>
+                  <pic:spPr>
+                    <a:xfrm>
+                      <a:off x="0" y="0"/>
+                      <a:ext cx="400106" cy="304843"/>
+                    </a:xfrm>
+                    <a:prstGeom prst="rect">
+                      <a:avLst/>
+                    </a:prstGeom>
+                  </pic:spPr>
+                </pic:pic>
+              </a:graphicData>
+            </a:graphic>
+          </wp:inline>
+        </w:drawing>
+      </w:r>
+      <w:r>
+        <w:t xml:space="preserve"> </w:t>
+      </w:r>
+      <w:r>
+        <w:t xml:space="preserve"> </w:t>
+      </w:r>
+      <w:r>
+        <w:t>permet de remettre le dataviz dans son état originel.</w:t>
+      </w:r>
+    </w:p>
+    <w:p>
+      <w:r>
+        <w:t>L’icône</w:t>
+      </w:r>
+      <w:r>
+        <w:t xml:space="preserve"> </w:t>
+      </w:r>
+      <w:r>
+        <w:t xml:space="preserve"> </w:t>
+      </w:r>
+      <w:r>
+        <w:drawing>
+          <wp:inline distT="0" distB="0" distL="0" distR="0" wp14:anchorId="31B313A3" wp14:editId="3E051840">
+            <wp:extent cx="314369" cy="295316"/>
+            <wp:effectExtent l="0" t="0" r="9525" b="9525"/>
+            <wp:docPr id="1995010921" name="Image 1"/>
+            <wp:cNvGraphicFramePr>
+              <a:graphicFrameLocks xmlns:a="http://schemas.openxmlformats.org/drawingml/2006/main" noChangeAspect="1"/>
+            </wp:cNvGraphicFramePr>
+            <a:graphic xmlns:a="http://schemas.openxmlformats.org/drawingml/2006/main">
+              <a:graphicData uri="http://schemas.openxmlformats.org/drawingml/2006/picture">
+                <pic:pic xmlns:pic="http://schemas.openxmlformats.org/drawingml/2006/picture">
+                  <pic:nvPicPr>
+                    <pic:cNvPr id="1995010921" name=""/>
+                    <pic:cNvPicPr/>
+                  </pic:nvPicPr>
+                  <pic:blipFill>
+                    <a:blip r:embed="rId48"/>
+                    <a:stretch>
+                      <a:fillRect/>
+                    </a:stretch>
+                  </pic:blipFill>
+                  <pic:spPr>
+                    <a:xfrm>
+                      <a:off x="0" y="0"/>
+                      <a:ext cx="314369" cy="295316"/>
+                    </a:xfrm>
+                    <a:prstGeom prst="rect">
+                      <a:avLst/>
+                    </a:prstGeom>
+                  </pic:spPr>
+                </pic:pic>
+              </a:graphicData>
+            </a:graphic>
+          </wp:inline>
+        </w:drawing>
+      </w:r>
+      <w:r>
+        <w:t xml:space="preserve"> permet d</w:t>
+      </w:r>
+      <w:r>
+        <w:t>’activer ou non l’affichage de données en surimpression</w:t>
+      </w:r>
+      <w:r>
+        <w:t>.</w:t>
+      </w:r>
+    </w:p>
+    <w:p>
+      <w:r>
+        <w:t>L’icône</w:t>
+      </w:r>
+      <w:r>
+        <w:t xml:space="preserve"> </w:t>
+      </w:r>
+      <w:r>
+        <w:t xml:space="preserve"> </w:t>
+      </w:r>
+      <w:r>
+        <w:drawing>
+          <wp:inline distT="0" distB="0" distL="0" distR="0" wp14:anchorId="2FC95880" wp14:editId="5A54E61D">
+            <wp:extent cx="285790" cy="257211"/>
+            <wp:effectExtent l="0" t="0" r="0" b="9525"/>
+            <wp:docPr id="2034021147" name="Image 1"/>
+            <wp:cNvGraphicFramePr>
+              <a:graphicFrameLocks xmlns:a="http://schemas.openxmlformats.org/drawingml/2006/main" noChangeAspect="1"/>
+            </wp:cNvGraphicFramePr>
+            <a:graphic xmlns:a="http://schemas.openxmlformats.org/drawingml/2006/main">
+              <a:graphicData uri="http://schemas.openxmlformats.org/drawingml/2006/picture">
+                <pic:pic xmlns:pic="http://schemas.openxmlformats.org/drawingml/2006/picture">
+                  <pic:nvPicPr>
+                    <pic:cNvPr id="2034021147" name=""/>
+                    <pic:cNvPicPr/>
+                  </pic:nvPicPr>
+                  <pic:blipFill>
+                    <a:blip r:embed="rId49"/>
+                    <a:stretch>
+                      <a:fillRect/>
+                    </a:stretch>
+                  </pic:blipFill>
+                  <pic:spPr>
+                    <a:xfrm>
+                      <a:off x="0" y="0"/>
+                      <a:ext cx="285790" cy="257211"/>
+                    </a:xfrm>
+                    <a:prstGeom prst="rect">
+                      <a:avLst/>
+                    </a:prstGeom>
+                  </pic:spPr>
+                </pic:pic>
+              </a:graphicData>
+            </a:graphic>
+          </wp:inline>
+        </w:drawing>
+      </w:r>
+      <w:r>
+        <w:t xml:space="preserve"> </w:t>
+      </w:r>
+      <w:r>
+        <w:t xml:space="preserve"> </w:t>
+      </w:r>
+      <w:r>
+        <w:t>permet de normaliser localement l’échelle de couleur. Par défaut l’échelle de couleur est centrée sur la moyenne pondérée nationale, après avoir activé la normalisation locale, l’échelle est centrée sur la moyenne pondérée locale.</w:t>
+      </w:r>
+    </w:p>
+    <w:p/>
+    <w:p>
+      <w:r>
+        <w:t>L’icône</w:t>
+      </w:r>
+      <w:r>
+        <w:t xml:space="preserve"> </w:t>
+      </w:r>
+      <w:r>
+        <w:t xml:space="preserve"> </w:t>
+      </w:r>
+      <w:r>
+        <w:drawing>
+          <wp:inline distT="0" distB="0" distL="0" distR="0" wp14:anchorId="014B348A" wp14:editId="3D2B42FD">
+            <wp:extent cx="323895" cy="314369"/>
+            <wp:effectExtent l="0" t="0" r="0" b="9525"/>
+            <wp:docPr id="1643142503" name="Image 1"/>
+            <wp:cNvGraphicFramePr>
+              <a:graphicFrameLocks xmlns:a="http://schemas.openxmlformats.org/drawingml/2006/main" noChangeAspect="1"/>
+            </wp:cNvGraphicFramePr>
+            <a:graphic xmlns:a="http://schemas.openxmlformats.org/drawingml/2006/main">
+              <a:graphicData uri="http://schemas.openxmlformats.org/drawingml/2006/picture">
+                <pic:pic xmlns:pic="http://schemas.openxmlformats.org/drawingml/2006/picture">
+                  <pic:nvPicPr>
+                    <pic:cNvPr id="1643142503" name=""/>
+                    <pic:cNvPicPr/>
+                  </pic:nvPicPr>
+                  <pic:blipFill>
+                    <a:blip r:embed="rId50"/>
+                    <a:stretch>
+                      <a:fillRect/>
+                    </a:stretch>
+                  </pic:blipFill>
+                  <pic:spPr>
+                    <a:xfrm>
+                      <a:off x="0" y="0"/>
+                      <a:ext cx="323895" cy="314369"/>
+                    </a:xfrm>
+                    <a:prstGeom prst="rect">
+                      <a:avLst/>
+                    </a:prstGeom>
+                  </pic:spPr>
+                </pic:pic>
+              </a:graphicData>
+            </a:graphic>
+          </wp:inline>
+        </w:drawing>
+      </w:r>
+      <w:r>
+        <w:t xml:space="preserve"> </w:t>
+      </w:r>
+      <w:r>
+        <w:t xml:space="preserve"> </w:t>
+      </w:r>
+      <w:r>
+        <w:t>permet de supprimer les lignes de contours grises autours des délimitations géographiques comme les IRIS et les communes.</w:t>
+      </w:r>
+    </w:p>
+    <w:p>
+      <w:r>
+        <w:lastRenderedPageBreak/>
+        <w:t>L’icône</w:t>
+      </w:r>
+      <w:r>
+        <w:t xml:space="preserve"> </w:t>
+      </w:r>
+      <w:r>
+        <w:t xml:space="preserve"> </w:t>
+      </w:r>
+      <w:r>
+        <w:drawing>
+          <wp:inline distT="0" distB="0" distL="0" distR="0" wp14:anchorId="4263095F" wp14:editId="6C6B65FD">
+            <wp:extent cx="371527" cy="381053"/>
+            <wp:effectExtent l="0" t="0" r="9525" b="0"/>
+            <wp:docPr id="1107217576" name="Image 1"/>
+            <wp:cNvGraphicFramePr>
+              <a:graphicFrameLocks xmlns:a="http://schemas.openxmlformats.org/drawingml/2006/main" noChangeAspect="1"/>
+            </wp:cNvGraphicFramePr>
+            <a:graphic xmlns:a="http://schemas.openxmlformats.org/drawingml/2006/main">
+              <a:graphicData uri="http://schemas.openxmlformats.org/drawingml/2006/picture">
+                <pic:pic xmlns:pic="http://schemas.openxmlformats.org/drawingml/2006/picture">
+                  <pic:nvPicPr>
+                    <pic:cNvPr id="1107217576" name=""/>
+                    <pic:cNvPicPr/>
+                  </pic:nvPicPr>
+                  <pic:blipFill>
+                    <a:blip r:embed="rId51"/>
+                    <a:stretch>
+                      <a:fillRect/>
+                    </a:stretch>
+                  </pic:blipFill>
+                  <pic:spPr>
+                    <a:xfrm>
+                      <a:off x="0" y="0"/>
+                      <a:ext cx="371527" cy="381053"/>
+                    </a:xfrm>
+                    <a:prstGeom prst="rect">
+                      <a:avLst/>
+                    </a:prstGeom>
+                  </pic:spPr>
+                </pic:pic>
+              </a:graphicData>
+            </a:graphic>
+          </wp:inline>
+        </w:drawing>
+      </w:r>
+      <w:r>
+        <w:t xml:space="preserve"> permet d’afficher ou non une carte géographique en </w:t>
+      </w:r>
+      <w:r>
+        <w:t>arrière-plan</w:t>
+      </w:r>
+      <w:r>
+        <w:t>.</w:t>
       </w:r>
     </w:p>
     <w:p/>
@@ -11184,14 +12083,6 @@
       <w:r>
         <w:t>GeoDataViz</w:t>
       </w:r>
-    </w:p>
-    <w:p>
-      <w:pPr>
-        <w:rPr>
-          <w:kern w:val="0"/>
-          <w14:ligatures w14:val="none"/>
-        </w:rPr>
-      </w:pPr>
     </w:p>
     <w:p/>
     <w:p>
@@ -11218,7 +12109,7 @@
                     <pic:cNvPicPr/>
                   </pic:nvPicPr>
                   <pic:blipFill>
-                    <a:blip r:embed="rId40"/>
+                    <a:blip r:embed="rId52"/>
                     <a:stretch>
                       <a:fillRect/>
                     </a:stretch>
@@ -11379,7 +12270,6 @@
           <w:b/>
           <w:bCs/>
         </w:rPr>
-        <w:lastRenderedPageBreak/>
         <w:t>Constante de la fonction de décroissance</w:t>
       </w:r>
       <w:r>
@@ -11497,84 +12387,6 @@
           <w:rFonts w:eastAsia="Times New Roman"/>
         </w:rPr>
         <w:t> : les APL sont calculés à l’échelle des IRIS, mais peuvent être visualisés à l’échelle communale. Une moyenne pondérée par la population ajustée est alors calculée.</w:t>
-      </w:r>
-    </w:p>
-    <w:p>
-      <w:pPr>
-        <w:spacing w:line="256" w:lineRule="auto"/>
-        <w:jc w:val="both"/>
-        <w:rPr>
-          <w:rFonts w:eastAsia="Times New Roman"/>
-          <w:kern w:val="0"/>
-          <w14:ligatures w14:val="none"/>
-        </w:rPr>
-      </w:pPr>
-    </w:p>
-    <w:p>
-      <w:pPr>
-        <w:spacing w:line="256" w:lineRule="auto"/>
-        <w:jc w:val="both"/>
-        <w:rPr>
-          <w:rFonts w:eastAsia="Times New Roman"/>
-        </w:rPr>
-      </w:pPr>
-      <w:r>
-        <w:rPr>
-          <w:rFonts w:eastAsia="Times New Roman"/>
-          <w:kern w:val="0"/>
-          <w14:ligatures w14:val="none"/>
-        </w:rPr>
-        <w:t xml:space="preserve">Dans la boite à outils du Dataviz il est possible </w:t>
-      </w:r>
-      <w:commentRangeStart w:id="25"/>
-      <w:commentRangeStart w:id="26"/>
-      <w:commentRangeStart w:id="27"/>
-      <w:commentRangeStart w:id="28"/>
-      <w:r>
-        <w:rPr>
-          <w:rFonts w:eastAsia="Times New Roman"/>
-        </w:rPr>
-        <w:t>de modifier l’échelle des couleurs pour la centrer sur la moyenne pondérée locale et non la moyenne pondérée française.</w:t>
-      </w:r>
-      <w:commentRangeEnd w:id="25"/>
-      <w:r>
-        <w:rPr>
-          <w:rStyle w:val="Marquedecommentaire"/>
-          <w:rFonts w:eastAsia="Times New Roman"/>
-          <w:sz w:val="22"/>
-          <w:szCs w:val="22"/>
-        </w:rPr>
-        <w:commentReference w:id="25"/>
-      </w:r>
-      <w:commentRangeEnd w:id="26"/>
-      <w:r>
-        <w:rPr>
-          <w:rStyle w:val="Marquedecommentaire"/>
-          <w:rFonts w:eastAsia="Times New Roman"/>
-          <w:sz w:val="22"/>
-          <w:szCs w:val="22"/>
-        </w:rPr>
-        <w:commentReference w:id="26"/>
-      </w:r>
-      <w:commentRangeEnd w:id="27"/>
-      <w:r>
-        <w:rPr>
-          <w:rStyle w:val="Marquedecommentaire"/>
-          <w:rFonts w:eastAsia="Times New Roman"/>
-          <w:sz w:val="22"/>
-          <w:szCs w:val="22"/>
-        </w:rPr>
-        <w:commentReference w:id="27"/>
-      </w:r>
-      <w:commentRangeEnd w:id="28"/>
-      <w:r>
-        <w:rPr>
-          <w:rStyle w:val="Marquedecommentaire"/>
-          <w:rFonts w:eastAsia="Times New Roman"/>
-          <w:sz w:val="22"/>
-          <w:szCs w:val="22"/>
-        </w:rPr>
-        <w:commentReference w:id="28"/>
       </w:r>
     </w:p>
     <w:p>
@@ -11740,7 +12552,7 @@
       </w:r>
     </w:p>
   </w:comment>
-  <w:comment w:id="7" w:author="MONTMARTIN Benjamin" w:date="2026-04-22T22:46:00Z" w:initials="BM">
+  <w:comment w:id="7" w:author="Cyril Vincent" w:date="2026-04-27T13:25:00Z" w:initials="CV">
     <w:p>
       <w:pPr>
         <w:pStyle w:val="Commentaire"/>
@@ -11752,11 +12564,27 @@
         <w:annotationRef/>
       </w:r>
       <w:r>
+        <w:t>J’ai créé le paragraphe 3.5.3 pour celà</w:t>
+      </w:r>
+    </w:p>
+  </w:comment>
+  <w:comment w:id="8" w:author="MONTMARTIN Benjamin" w:date="2026-04-22T22:46:00Z" w:initials="BM">
+    <w:p>
+      <w:pPr>
+        <w:pStyle w:val="Commentaire"/>
+      </w:pPr>
+      <w:r>
+        <w:rPr>
+          <w:rStyle w:val="Marquedecommentaire"/>
+        </w:rPr>
+        <w:annotationRef/>
+      </w:r>
+      <w:r>
         <w:t>Du coup c’est incohérent avec le fait d’avoir un poids de 1/20 pour les 18-24. D’ailleurs après 18 ans on ne consulte plus de pédiatre normalement</w:t>
       </w:r>
     </w:p>
   </w:comment>
-  <w:comment w:id="8" w:author="MONTMARTIN Benjamin" w:date="2026-04-23T09:53:00Z" w:initials="BM">
+  <w:comment w:id="9" w:author="Cyril Vincent" w:date="2026-04-27T15:20:00Z" w:initials="CV">
     <w:p>
       <w:pPr>
         <w:pStyle w:val="Commentaire"/>
@@ -11768,11 +12596,59 @@
         <w:annotationRef/>
       </w:r>
       <w:r>
+        <w:t>Ok j’ai modifié la répartition, j’ai ajouté le 1/20 dans les 0-2 ans, j’ai modifié le code python également et je vais refaire tourner les calculs</w:t>
+      </w:r>
+    </w:p>
+  </w:comment>
+  <w:comment w:id="10" w:author="MONTMARTIN Benjamin" w:date="2026-04-23T11:50:00Z" w:initials="BM">
+    <w:p>
+      <w:pPr>
+        <w:pStyle w:val="Commentaire"/>
+      </w:pPr>
+      <w:r>
+        <w:rPr>
+          <w:rStyle w:val="Marquedecommentaire"/>
+        </w:rPr>
+        <w:annotationRef/>
+      </w:r>
+      <w:r>
+        <w:t>Il faudrait expliquer comment TR est calculé à partir de DAMIR et ce qu’il représente précisément (le nombre d’actes moyen pour un individu de la classe a?)</w:t>
+      </w:r>
+    </w:p>
+  </w:comment>
+  <w:comment w:id="11" w:author="Cyril Vincent" w:date="2026-04-27T13:25:00Z" w:initials="CV">
+    <w:p>
+      <w:pPr>
+        <w:pStyle w:val="Commentaire"/>
+      </w:pPr>
+      <w:r>
+        <w:rPr>
+          <w:rStyle w:val="Marquedecommentaire"/>
+        </w:rPr>
+        <w:annotationRef/>
+      </w:r>
+      <w:r>
+        <w:t>J’ai créé le paragraphe 3.5.3 pour celà</w:t>
+      </w:r>
+    </w:p>
+  </w:comment>
+  <w:comment w:id="12" w:author="MONTMARTIN Benjamin" w:date="2026-04-23T09:53:00Z" w:initials="BM">
+    <w:p>
+      <w:pPr>
+        <w:pStyle w:val="Commentaire"/>
+      </w:pPr>
+      <w:r>
+        <w:rPr>
+          <w:rStyle w:val="Marquedecommentaire"/>
+        </w:rPr>
+        <w:annotationRef/>
+      </w:r>
+      <w:r>
         <w:t>Je ne comprends pas pourquoi on mentionne ici les communes. Si on construit un indicateur au niveau IRIS, pourquoi parle-t-on des communes?</w:t>
       </w:r>
     </w:p>
   </w:comment>
-  <w:comment w:id="9" w:author="MONTMARTIN Benjamin" w:date="2026-04-23T09:54:00Z" w:initials="BM">
+  <w:comment w:id="13" w:author="Cyril Vincent" w:date="2026-04-27T16:16:00Z" w:initials="CV">
     <w:p>
       <w:pPr>
         <w:pStyle w:val="Commentaire"/>
@@ -11784,11 +12660,27 @@
         <w:annotationRef/>
       </w:r>
       <w:r>
+        <w:t>Corrigé</w:t>
+      </w:r>
+    </w:p>
+  </w:comment>
+  <w:comment w:id="14" w:author="MONTMARTIN Benjamin" w:date="2026-04-23T09:54:00Z" w:initials="BM">
+    <w:p>
+      <w:pPr>
+        <w:pStyle w:val="Commentaire"/>
+      </w:pPr>
+      <w:r>
+        <w:rPr>
+          <w:rStyle w:val="Marquedecommentaire"/>
+        </w:rPr>
+        <w:annotationRef/>
+      </w:r>
+      <w:r>
         <w:t>Il faudrait mettre les références complètes en note de bas de page</w:t>
       </w:r>
     </w:p>
   </w:comment>
-  <w:comment w:id="10" w:author="MONTMARTIN Benjamin" w:date="2026-04-23T09:56:00Z" w:initials="BM">
+  <w:comment w:id="15" w:author="Cyril Vincent" w:date="2026-04-27T16:24:00Z" w:initials="CV">
     <w:p>
       <w:pPr>
         <w:pStyle w:val="Commentaire"/>
@@ -11800,11 +12692,27 @@
         <w:annotationRef/>
       </w:r>
       <w:r>
+        <w:t>OK</w:t>
+      </w:r>
+    </w:p>
+  </w:comment>
+  <w:comment w:id="16" w:author="MONTMARTIN Benjamin" w:date="2026-04-23T09:56:00Z" w:initials="BM">
+    <w:p>
+      <w:pPr>
+        <w:pStyle w:val="Commentaire"/>
+      </w:pPr>
+      <w:r>
+        <w:rPr>
+          <w:rStyle w:val="Marquedecommentaire"/>
+        </w:rPr>
+        <w:annotationRef/>
+      </w:r>
+      <w:r>
         <w:t>Pareil, je pense qu’il faut éviter un maximum de mentionner le niveau communale afin de ne pas perdre le lecteur et rester le plus cohérent possible</w:t>
       </w:r>
     </w:p>
   </w:comment>
-  <w:comment w:id="11" w:author="MONTMARTIN Benjamin" w:date="2026-04-23T09:57:00Z" w:initials="BM">
+  <w:comment w:id="17" w:author="Cyril Vincent" w:date="2026-04-27T16:17:00Z" w:initials="CV">
     <w:p>
       <w:pPr>
         <w:pStyle w:val="Commentaire"/>
@@ -11816,11 +12724,27 @@
         <w:annotationRef/>
       </w:r>
       <w:r>
+        <w:t>Corrigé</w:t>
+      </w:r>
+    </w:p>
+  </w:comment>
+  <w:comment w:id="18" w:author="MONTMARTIN Benjamin" w:date="2026-04-23T09:57:00Z" w:initials="BM">
+    <w:p>
+      <w:pPr>
+        <w:pStyle w:val="Commentaire"/>
+      </w:pPr>
+      <w:r>
+        <w:rPr>
+          <w:rStyle w:val="Marquedecommentaire"/>
+        </w:rPr>
+        <w:annotationRef/>
+      </w:r>
+      <w:r>
         <w:t>Redondant avec le premier paragraphe. A supprimer je pense</w:t>
       </w:r>
     </w:p>
   </w:comment>
-  <w:comment w:id="12" w:author="MONTMARTIN Benjamin" w:date="2026-04-23T10:00:00Z" w:initials="BM">
+  <w:comment w:id="19" w:author="Cyril Vincent" w:date="2026-04-27T16:24:00Z" w:initials="CV">
     <w:p>
       <w:pPr>
         <w:pStyle w:val="Commentaire"/>
@@ -11832,11 +12756,11 @@
         <w:annotationRef/>
       </w:r>
       <w:r>
-        <w:t>Tu veux dire son APL ?</w:t>
+        <w:t>OK</w:t>
       </w:r>
     </w:p>
   </w:comment>
-  <w:comment w:id="13" w:author="Cyril Vincent" w:date="2026-04-21T09:50:00Z" w:initials="CV">
+  <w:comment w:id="20" w:author="Cyril Vincent" w:date="2026-04-21T09:50:00Z" w:initials="CV">
     <w:p>
       <w:pPr>
         <w:pStyle w:val="Commentaire"/>
@@ -11852,7 +12776,7 @@
       </w:r>
     </w:p>
   </w:comment>
-  <w:comment w:id="16" w:author="MONTMARTIN Benjamin" w:date="2026-04-23T09:58:00Z" w:initials="BM">
+  <w:comment w:id="21" w:author="MONTMARTIN Benjamin" w:date="2026-04-17T11:08:00Z" w:initials="BM">
     <w:p>
       <w:pPr>
         <w:pStyle w:val="Commentaire"/>
@@ -11864,11 +12788,11 @@
         <w:annotationRef/>
       </w:r>
       <w:r>
-        <w:t>Ce graphique est bien mais je pense que le terme commune n’est pas trop adapté et porte à confusion</w:t>
+        <w:t>Un peu difficile à suivre</w:t>
       </w:r>
     </w:p>
   </w:comment>
-  <w:comment w:id="15" w:author="MONTMARTIN Benjamin" w:date="2026-04-23T10:01:00Z" w:initials="BM">
+  <w:comment w:id="22" w:author="Cyril Vincent" w:date="2026-04-28T10:28:00Z" w:initials="CV">
     <w:p>
       <w:pPr>
         <w:pStyle w:val="Commentaire"/>
@@ -11880,11 +12804,11 @@
         <w:annotationRef/>
       </w:r>
       <w:r>
-        <w:t>Pareil que pour le reste, il faudrait mettre les Rjs en mode equation avec le js en indice</w:t>
+        <w:t>J’ai reformulé et mis des infos entre parenthèse</w:t>
       </w:r>
     </w:p>
   </w:comment>
-  <w:comment w:id="14" w:author="MONTMARTIN Benjamin" w:date="2026-04-23T10:05:00Z" w:initials="BM">
+  <w:comment w:id="23" w:author="Cyril Vincent" w:date="2026-04-21T10:01:00Z" w:initials="CV">
     <w:p>
       <w:pPr>
         <w:pStyle w:val="Commentaire"/>
@@ -11896,11 +12820,11 @@
         <w:annotationRef/>
       </w:r>
       <w:r>
-        <w:t xml:space="preserve">Pour être bien cohérent avec le reste du document il faudrait réutiliser les termes précédents. PSis n’est pas définit je pense que tu fais référence à Nbis. </w:t>
+        <w:t>Une fois le document validé on pourra mettre cette partie dans un autre document (à voir)</w:t>
       </w:r>
     </w:p>
   </w:comment>
-  <w:comment w:id="18" w:author="MONTMARTIN Benjamin" w:date="2026-04-17T11:08:00Z" w:initials="BM">
+  <w:comment w:id="24" w:author="MONTMARTIN Benjamin" w:date="2026-04-17T11:44:00Z" w:initials="BM">
     <w:p>
       <w:pPr>
         <w:pStyle w:val="Commentaire"/>
@@ -11912,11 +12836,11 @@
         <w:annotationRef/>
       </w:r>
       <w:r>
-        <w:t>Commune?</w:t>
+        <w:t>A reprendre</w:t>
       </w:r>
     </w:p>
   </w:comment>
-  <w:comment w:id="19" w:author="MONTMARTIN Benjamin" w:date="2026-04-23T10:24:00Z" w:initials="BM">
+  <w:comment w:id="25" w:author="Cyril Vincent" w:date="2026-04-21T08:37:00Z" w:initials="CV">
     <w:p>
       <w:pPr>
         <w:pStyle w:val="Commentaire"/>
@@ -11928,11 +12852,11 @@
         <w:annotationRef/>
       </w:r>
       <w:r>
-        <w:t>Ce devrait être iris non?</w:t>
+        <w:t>OK</w:t>
       </w:r>
     </w:p>
   </w:comment>
-  <w:comment w:id="17" w:author="MONTMARTIN Benjamin" w:date="2026-04-17T11:08:00Z" w:initials="BM">
+  <w:comment w:id="26" w:author="MONTMARTIN Benjamin" w:date="2026-04-23T10:54:00Z" w:initials="BM">
     <w:p>
       <w:pPr>
         <w:pStyle w:val="Commentaire"/>
@@ -11944,151 +12868,7 @@
         <w:annotationRef/>
       </w:r>
       <w:r>
-        <w:t>Un peu difficile à suivre</w:t>
-      </w:r>
-    </w:p>
-  </w:comment>
-  <w:comment w:id="20" w:author="MONTMARTIN Benjamin" w:date="2026-04-23T10:27:00Z" w:initials="BM">
-    <w:p>
-      <w:pPr>
-        <w:pStyle w:val="Commentaire"/>
-      </w:pPr>
-      <w:r>
-        <w:rPr>
-          <w:rStyle w:val="Marquedecommentaire"/>
-        </w:rPr>
-        <w:annotationRef/>
-      </w:r>
-      <w:r>
-        <w:t>Rajouter une légende pour les couleurs et une petite interprétation sur la répartition géographique de l’APL</w:t>
-      </w:r>
-    </w:p>
-  </w:comment>
-  <w:comment w:id="21" w:author="Cyril Vincent" w:date="2026-04-21T10:01:00Z" w:initials="CV">
-    <w:p>
-      <w:pPr>
-        <w:pStyle w:val="Commentaire"/>
-      </w:pPr>
-      <w:r>
-        <w:rPr>
-          <w:rStyle w:val="Marquedecommentaire"/>
-        </w:rPr>
-        <w:annotationRef/>
-      </w:r>
-      <w:r>
-        <w:t>Une fois le document validé on pourra mettre cette partie dans un autre document (à voir)</w:t>
-      </w:r>
-    </w:p>
-  </w:comment>
-  <w:comment w:id="22" w:author="MONTMARTIN Benjamin" w:date="2026-04-17T11:44:00Z" w:initials="BM">
-    <w:p>
-      <w:pPr>
-        <w:pStyle w:val="Commentaire"/>
-      </w:pPr>
-      <w:r>
-        <w:rPr>
-          <w:rStyle w:val="Marquedecommentaire"/>
-        </w:rPr>
-        <w:annotationRef/>
-      </w:r>
-      <w:r>
-        <w:t>A reprendre</w:t>
-      </w:r>
-    </w:p>
-  </w:comment>
-  <w:comment w:id="23" w:author="Cyril Vincent" w:date="2026-04-21T08:37:00Z" w:initials="CV">
-    <w:p>
-      <w:pPr>
-        <w:pStyle w:val="Commentaire"/>
-      </w:pPr>
-      <w:r>
-        <w:rPr>
-          <w:rStyle w:val="Marquedecommentaire"/>
-        </w:rPr>
-        <w:annotationRef/>
-      </w:r>
-      <w:r>
-        <w:t>OK</w:t>
-      </w:r>
-    </w:p>
-  </w:comment>
-  <w:comment w:id="24" w:author="MONTMARTIN Benjamin" w:date="2026-04-23T10:54:00Z" w:initials="BM">
-    <w:p>
-      <w:pPr>
-        <w:pStyle w:val="Commentaire"/>
-      </w:pPr>
-      <w:r>
-        <w:rPr>
-          <w:rStyle w:val="Marquedecommentaire"/>
-        </w:rPr>
-        <w:annotationRef/>
-      </w:r>
-      <w:r>
         <w:t>Il faudrait détailler ici les différentes fonctionalités de la Toolbar avec une copie d’écran comme pour les paramètres avancés</w:t>
-      </w:r>
-    </w:p>
-  </w:comment>
-  <w:comment w:id="25" w:author="MONTMARTIN Benjamin" w:date="2026-04-17T11:37:00Z" w:initials="BM">
-    <w:p>
-      <w:pPr>
-        <w:pStyle w:val="Commentaire"/>
-      </w:pPr>
-      <w:r>
-        <w:rPr>
-          <w:rStyle w:val="Marquedecommentaire"/>
-        </w:rPr>
-        <w:annotationRef/>
-      </w:r>
-      <w:r>
-        <w:t>Ça c’est pas dans les choix des paramètres avancés. Je pense qu’il serait utile d’ajouter et d’expliquer les options qui sont disponibles lorsque la carte s’affiche</w:t>
-      </w:r>
-    </w:p>
-  </w:comment>
-  <w:comment w:id="26" w:author="MONTMARTIN Benjamin" w:date="2026-04-17T11:47:00Z" w:initials="BM">
-    <w:p>
-      <w:pPr>
-        <w:pStyle w:val="Commentaire"/>
-      </w:pPr>
-      <w:r>
-        <w:rPr>
-          <w:rStyle w:val="Marquedecommentaire"/>
-        </w:rPr>
-        <w:annotationRef/>
-      </w:r>
-      <w:r>
-        <w:t>D’ailleurs je pense qu’il faut le faire dans la partie où on présente le calcul national vs local</w:t>
-      </w:r>
-    </w:p>
-  </w:comment>
-  <w:comment w:id="27" w:author="Cyril Vincent" w:date="2026-04-21T09:27:00Z" w:initials="CV">
-    <w:p>
-      <w:pPr>
-        <w:pStyle w:val="Commentaire"/>
-      </w:pPr>
-      <w:r>
-        <w:rPr>
-          <w:rStyle w:val="Marquedecommentaire"/>
-        </w:rPr>
-        <w:annotationRef/>
-      </w:r>
-      <w:r>
-        <w:t>Pas sur de bien comprendre où le faire</w:t>
-      </w:r>
-    </w:p>
-  </w:comment>
-  <w:comment w:id="28" w:author="Cyril Vincent" w:date="2026-04-21T09:28:00Z" w:initials="CV">
-    <w:p>
-      <w:pPr>
-        <w:pStyle w:val="Commentaire"/>
-      </w:pPr>
-      <w:r>
-        <w:rPr>
-          <w:rStyle w:val="Marquedecommentaire"/>
-        </w:rPr>
-        <w:annotationRef/>
-      </w:r>
-      <w:r>
-        <w:t>C’est dispo dans la toolbar en haut à droite une fois que la carte est affichée</w:t>
       </w:r>
     </w:p>
   </w:comment>
@@ -12103,29 +12883,27 @@
   <w15:commentEx w15:paraId="52376E97" w15:done="0"/>
   <w15:commentEx w15:paraId="03F45284" w15:paraIdParent="52376E97" w15:done="0"/>
   <w15:commentEx w15:paraId="616716C7" w15:paraIdParent="52376E97" w15:done="0"/>
+  <w15:commentEx w15:paraId="47B570DA" w15:done="0"/>
+  <w15:commentEx w15:paraId="16B74752" w15:paraIdParent="47B570DA" w15:done="0"/>
+  <w15:commentEx w15:paraId="6D891C49" w15:done="0"/>
+  <w15:commentEx w15:paraId="0EF43C7E" w15:paraIdParent="6D891C49" w15:done="0"/>
   <w15:commentEx w15:paraId="09062843" w15:done="0"/>
-  <w15:commentEx w15:paraId="56043376" w15:done="0"/>
+  <w15:commentEx w15:paraId="2D737DE7" w15:paraIdParent="09062843" w15:done="0"/>
   <w15:commentEx w15:paraId="743119C2" w15:done="0"/>
+  <w15:commentEx w15:paraId="7675AC6F" w15:paraIdParent="743119C2" w15:done="0"/>
   <w15:commentEx w15:paraId="36DCA327" w15:done="0"/>
+  <w15:commentEx w15:paraId="409C9F65" w15:paraIdParent="36DCA327" w15:done="0"/>
   <w15:commentEx w15:paraId="403BD0A4" w15:done="0"/>
+  <w15:commentEx w15:paraId="7A1898D3" w15:paraIdParent="403BD0A4" w15:done="0"/>
   <w15:commentEx w15:paraId="55ECE455" w15:done="0"/>
-  <w15:commentEx w15:paraId="050F7441" w15:done="0"/>
+  <w15:commentEx w15:paraId="673BBDD1" w15:paraIdParent="55ECE455" w15:done="0"/>
   <w15:commentEx w15:paraId="26C0D67B" w15:done="0"/>
-  <w15:commentEx w15:paraId="2D876487" w15:done="0"/>
-  <w15:commentEx w15:paraId="6FEBDD58" w15:done="0"/>
-  <w15:commentEx w15:paraId="2487FF51" w15:done="0"/>
-  <w15:commentEx w15:paraId="2B60A01D" w15:done="0"/>
-  <w15:commentEx w15:paraId="06A39167" w15:paraIdParent="2B60A01D" w15:done="0"/>
   <w15:commentEx w15:paraId="019EE70E" w15:done="0"/>
-  <w15:commentEx w15:paraId="59F8F51C" w15:done="0"/>
+  <w15:commentEx w15:paraId="66E704A5" w15:paraIdParent="019EE70E" w15:done="0"/>
   <w15:commentEx w15:paraId="7BC1B538" w15:done="0"/>
   <w15:commentEx w15:paraId="0F96028B" w15:done="0"/>
   <w15:commentEx w15:paraId="710CFAED" w15:paraIdParent="0F96028B" w15:done="0"/>
   <w15:commentEx w15:paraId="31AB05EB" w15:done="0"/>
-  <w15:commentEx w15:paraId="63821131" w15:done="0"/>
-  <w15:commentEx w15:paraId="502B929B" w15:paraIdParent="63821131" w15:done="0"/>
-  <w15:commentEx w15:paraId="2AC8B5CC" w15:paraIdParent="63821131" w15:done="0"/>
-  <w15:commentEx w15:paraId="3176D6D1" w15:paraIdParent="63821131" w15:done="0"/>
 </w15:commentsEx>
 </file>
 
@@ -12137,29 +12915,27 @@
   <w16cex:commentExtensible w16cex:durableId="131A38AC" w16cex:dateUtc="2026-04-17T08:11:00Z"/>
   <w16cex:commentExtensible w16cex:durableId="31CA9815" w16cex:dateUtc="2026-04-20T10:41:00Z"/>
   <w16cex:commentExtensible w16cex:durableId="53C2FE73" w16cex:dateUtc="2026-04-21T07:43:00Z"/>
+  <w16cex:commentExtensible w16cex:durableId="0A787196" w16cex:dateUtc="2026-04-23T09:50:00Z"/>
+  <w16cex:commentExtensible w16cex:durableId="0F522257" w16cex:dateUtc="2026-04-27T11:25:00Z"/>
+  <w16cex:commentExtensible w16cex:durableId="273D6C06" w16cex:dateUtc="2026-04-22T20:46:00Z"/>
+  <w16cex:commentExtensible w16cex:durableId="3305CA85" w16cex:dateUtc="2026-04-27T13:20:00Z"/>
   <w16cex:commentExtensible w16cex:durableId="647BDB4A" w16cex:dateUtc="2026-04-23T09:50:00Z"/>
-  <w16cex:commentExtensible w16cex:durableId="273D6C06" w16cex:dateUtc="2026-04-22T20:46:00Z"/>
+  <w16cex:commentExtensible w16cex:durableId="2DF39A0C" w16cex:dateUtc="2026-04-27T11:25:00Z"/>
   <w16cex:commentExtensible w16cex:durableId="55052AFB" w16cex:dateUtc="2026-04-23T07:53:00Z"/>
+  <w16cex:commentExtensible w16cex:durableId="7F15BAD7" w16cex:dateUtc="2026-04-27T14:16:00Z"/>
   <w16cex:commentExtensible w16cex:durableId="7124EE28" w16cex:dateUtc="2026-04-23T07:54:00Z"/>
+  <w16cex:commentExtensible w16cex:durableId="45493965" w16cex:dateUtc="2026-04-27T14:24:00Z"/>
   <w16cex:commentExtensible w16cex:durableId="5D7CA495" w16cex:dateUtc="2026-04-23T07:56:00Z"/>
+  <w16cex:commentExtensible w16cex:durableId="6D75E478" w16cex:dateUtc="2026-04-27T14:17:00Z"/>
   <w16cex:commentExtensible w16cex:durableId="1BA9599C" w16cex:dateUtc="2026-04-23T07:57:00Z"/>
-  <w16cex:commentExtensible w16cex:durableId="10B9B1DB" w16cex:dateUtc="2026-04-23T08:00:00Z"/>
+  <w16cex:commentExtensible w16cex:durableId="78BD0B35" w16cex:dateUtc="2026-04-27T14:24:00Z"/>
   <w16cex:commentExtensible w16cex:durableId="7B76725F" w16cex:dateUtc="2026-04-21T07:50:00Z"/>
-  <w16cex:commentExtensible w16cex:durableId="184D9694" w16cex:dateUtc="2026-04-23T07:58:00Z"/>
-  <w16cex:commentExtensible w16cex:durableId="1A72FB5A" w16cex:dateUtc="2026-04-23T08:01:00Z"/>
-  <w16cex:commentExtensible w16cex:durableId="1CBA0F47" w16cex:dateUtc="2026-04-23T08:05:00Z"/>
-  <w16cex:commentExtensible w16cex:durableId="0B703907" w16cex:dateUtc="2026-04-17T09:08:00Z"/>
-  <w16cex:commentExtensible w16cex:durableId="004DD519" w16cex:dateUtc="2026-04-23T08:24:00Z"/>
   <w16cex:commentExtensible w16cex:durableId="7D3A8F71" w16cex:dateUtc="2026-04-17T09:08:00Z"/>
-  <w16cex:commentExtensible w16cex:durableId="3D6D18F1" w16cex:dateUtc="2026-04-23T08:27:00Z"/>
+  <w16cex:commentExtensible w16cex:durableId="79CC50BE" w16cex:dateUtc="2026-04-28T08:28:00Z"/>
   <w16cex:commentExtensible w16cex:durableId="15F8C9B4" w16cex:dateUtc="2026-04-21T08:01:00Z"/>
   <w16cex:commentExtensible w16cex:durableId="315DA95D" w16cex:dateUtc="2026-04-17T09:44:00Z"/>
   <w16cex:commentExtensible w16cex:durableId="3B41FBA8" w16cex:dateUtc="2026-04-21T06:37:00Z"/>
   <w16cex:commentExtensible w16cex:durableId="0AEB8EC3" w16cex:dateUtc="2026-04-23T08:54:00Z"/>
-  <w16cex:commentExtensible w16cex:durableId="3C94E391" w16cex:dateUtc="2026-04-17T09:37:00Z"/>
-  <w16cex:commentExtensible w16cex:durableId="268C54E1" w16cex:dateUtc="2026-04-17T09:47:00Z"/>
-  <w16cex:commentExtensible w16cex:durableId="0C39F087" w16cex:dateUtc="2026-04-21T07:27:00Z"/>
-  <w16cex:commentExtensible w16cex:durableId="14D986E1" w16cex:dateUtc="2026-04-21T07:28:00Z"/>
 </w16cex:commentsExtensible>
 </file>
 
@@ -12171,30 +12947,196 @@
   <w16cid:commentId w16cid:paraId="52376E97" w16cid:durableId="131A38AC"/>
   <w16cid:commentId w16cid:paraId="03F45284" w16cid:durableId="31CA9815"/>
   <w16cid:commentId w16cid:paraId="616716C7" w16cid:durableId="53C2FE73"/>
+  <w16cid:commentId w16cid:paraId="47B570DA" w16cid:durableId="0A787196"/>
+  <w16cid:commentId w16cid:paraId="16B74752" w16cid:durableId="0F522257"/>
+  <w16cid:commentId w16cid:paraId="6D891C49" w16cid:durableId="273D6C06"/>
+  <w16cid:commentId w16cid:paraId="0EF43C7E" w16cid:durableId="3305CA85"/>
   <w16cid:commentId w16cid:paraId="09062843" w16cid:durableId="647BDB4A"/>
-  <w16cid:commentId w16cid:paraId="56043376" w16cid:durableId="273D6C06"/>
+  <w16cid:commentId w16cid:paraId="2D737DE7" w16cid:durableId="2DF39A0C"/>
   <w16cid:commentId w16cid:paraId="743119C2" w16cid:durableId="55052AFB"/>
+  <w16cid:commentId w16cid:paraId="7675AC6F" w16cid:durableId="7F15BAD7"/>
   <w16cid:commentId w16cid:paraId="36DCA327" w16cid:durableId="7124EE28"/>
+  <w16cid:commentId w16cid:paraId="409C9F65" w16cid:durableId="45493965"/>
   <w16cid:commentId w16cid:paraId="403BD0A4" w16cid:durableId="5D7CA495"/>
+  <w16cid:commentId w16cid:paraId="7A1898D3" w16cid:durableId="6D75E478"/>
   <w16cid:commentId w16cid:paraId="55ECE455" w16cid:durableId="1BA9599C"/>
-  <w16cid:commentId w16cid:paraId="050F7441" w16cid:durableId="10B9B1DB"/>
+  <w16cid:commentId w16cid:paraId="673BBDD1" w16cid:durableId="78BD0B35"/>
   <w16cid:commentId w16cid:paraId="26C0D67B" w16cid:durableId="7B76725F"/>
-  <w16cid:commentId w16cid:paraId="2D876487" w16cid:durableId="184D9694"/>
-  <w16cid:commentId w16cid:paraId="6FEBDD58" w16cid:durableId="1A72FB5A"/>
-  <w16cid:commentId w16cid:paraId="2487FF51" w16cid:durableId="1CBA0F47"/>
-  <w16cid:commentId w16cid:paraId="2B60A01D" w16cid:durableId="0B703907"/>
-  <w16cid:commentId w16cid:paraId="06A39167" w16cid:durableId="004DD519"/>
   <w16cid:commentId w16cid:paraId="019EE70E" w16cid:durableId="7D3A8F71"/>
-  <w16cid:commentId w16cid:paraId="59F8F51C" w16cid:durableId="3D6D18F1"/>
+  <w16cid:commentId w16cid:paraId="66E704A5" w16cid:durableId="79CC50BE"/>
   <w16cid:commentId w16cid:paraId="7BC1B538" w16cid:durableId="15F8C9B4"/>
   <w16cid:commentId w16cid:paraId="0F96028B" w16cid:durableId="315DA95D"/>
   <w16cid:commentId w16cid:paraId="710CFAED" w16cid:durableId="3B41FBA8"/>
   <w16cid:commentId w16cid:paraId="31AB05EB" w16cid:durableId="0AEB8EC3"/>
-  <w16cid:commentId w16cid:paraId="63821131" w16cid:durableId="3C94E391"/>
-  <w16cid:commentId w16cid:paraId="502B929B" w16cid:durableId="268C54E1"/>
-  <w16cid:commentId w16cid:paraId="2AC8B5CC" w16cid:durableId="0C39F087"/>
-  <w16cid:commentId w16cid:paraId="3176D6D1" w16cid:durableId="14D986E1"/>
 </w16cid:commentsIds>
+</file>
+
+<file path=word/endnotes.xml><?xml version="1.0" encoding="utf-8"?>
+<w:endnotes xmlns:wpc="http://schemas.microsoft.com/office/word/2010/wordprocessingCanvas" xmlns:cx="http://schemas.microsoft.com/office/drawing/2014/chartex" xmlns:cx1="http://schemas.microsoft.com/office/drawing/2015/9/8/chartex" xmlns:cx2="http://schemas.microsoft.com/office/drawing/2015/10/21/chartex" xmlns:cx3="http://schemas.microsoft.com/office/drawing/2016/5/9/chartex" xmlns:cx4="http://schemas.microsoft.com/office/drawing/2016/5/10/chartex" xmlns:cx5="http://schemas.microsoft.com/office/drawing/2016/5/11/chartex" xmlns:cx6="http://schemas.microsoft.com/office/drawing/2016/5/12/chartex" xmlns:cx7="http://schemas.microsoft.com/office/drawing/2016/5/13/chartex" xmlns:cx8="http://schemas.microsoft.com/office/drawing/2016/5/14/chartex" xmlns:mc="http://schemas.openxmlformats.org/markup-compatibility/2006" xmlns:aink="http://schemas.microsoft.com/office/drawing/2016/ink" xmlns:am3d="http://schemas.microsoft.com/office/drawing/2017/model3d" xmlns:o="urn:schemas-microsoft-com:office:office" xmlns:oel="http://schemas.microsoft.com/office/2019/extlst" xmlns:r="http://schemas.openxmlformats.org/officeDocument/2006/relationships" xmlns:m="http://schemas.openxmlformats.org/officeDocument/2006/math" xmlns:v="urn:schemas-microsoft-com:vml" xmlns:wp14="http://schemas.microsoft.com/office/word/2010/wordprocessingDrawing" xmlns:wp="http://schemas.openxmlformats.org/drawingml/2006/wordprocessingDrawing" xmlns:w10="urn:schemas-microsoft-com:office:word" xmlns:w="http://schemas.openxmlformats.org/wordprocessingml/2006/main" xmlns:w14="http://schemas.microsoft.com/office/word/2010/wordml" xmlns:w15="http://schemas.microsoft.com/office/word/2012/wordml" xmlns:w16cex="http://schemas.microsoft.com/office/word/2018/wordml/cex" xmlns:w16cid="http://schemas.microsoft.com/office/word/2016/wordml/cid" xmlns:w16="http://schemas.microsoft.com/office/word/2018/wordml" xmlns:w16du="http://schemas.microsoft.com/office/word/2023/wordml/word16du" xmlns:w16sdtdh="http://schemas.microsoft.com/office/word/2020/wordml/sdtdatahash" xmlns:w16sdtfl="http://schemas.microsoft.com/office/word/2024/wordml/sdtformatlock" xmlns:w16se="http://schemas.microsoft.com/office/word/2015/wordml/symex" xmlns:wpg="http://schemas.microsoft.com/office/word/2010/wordprocessingGroup" xmlns:wpi="http://schemas.microsoft.com/office/word/2010/wordprocessingInk" xmlns:wne="http://schemas.microsoft.com/office/word/2006/wordml" xmlns:wps="http://schemas.microsoft.com/office/word/2010/wordprocessingShape" mc:Ignorable="w14 w15 w16se w16cid w16 w16cex w16sdtdh w16sdtfl w16du wp14">
+  <w:endnote w:type="separator" w:id="-1">
+    <w:p>
+      <w:pPr>
+        <w:spacing w:line="240" w:lineRule="auto"/>
+      </w:pPr>
+      <w:r>
+        <w:separator/>
+      </w:r>
+    </w:p>
+  </w:endnote>
+  <w:endnote w:type="continuationSeparator" w:id="0">
+    <w:p>
+      <w:pPr>
+        <w:spacing w:line="240" w:lineRule="auto"/>
+      </w:pPr>
+      <w:r>
+        <w:continuationSeparator/>
+      </w:r>
+    </w:p>
+  </w:endnote>
+</w:endnotes>
+</file>
+
+<file path=word/footnotes.xml><?xml version="1.0" encoding="utf-8"?>
+<w:footnotes xmlns:wpc="http://schemas.microsoft.com/office/word/2010/wordprocessingCanvas" xmlns:cx="http://schemas.microsoft.com/office/drawing/2014/chartex" xmlns:cx1="http://schemas.microsoft.com/office/drawing/2015/9/8/chartex" xmlns:cx2="http://schemas.microsoft.com/office/drawing/2015/10/21/chartex" xmlns:cx3="http://schemas.microsoft.com/office/drawing/2016/5/9/chartex" xmlns:cx4="http://schemas.microsoft.com/office/drawing/2016/5/10/chartex" xmlns:cx5="http://schemas.microsoft.com/office/drawing/2016/5/11/chartex" xmlns:cx6="http://schemas.microsoft.com/office/drawing/2016/5/12/chartex" xmlns:cx7="http://schemas.microsoft.com/office/drawing/2016/5/13/chartex" xmlns:cx8="http://schemas.microsoft.com/office/drawing/2016/5/14/chartex" xmlns:mc="http://schemas.openxmlformats.org/markup-compatibility/2006" xmlns:aink="http://schemas.microsoft.com/office/drawing/2016/ink" xmlns:am3d="http://schemas.microsoft.com/office/drawing/2017/model3d" xmlns:o="urn:schemas-microsoft-com:office:office" xmlns:oel="http://schemas.microsoft.com/office/2019/extlst" xmlns:r="http://schemas.openxmlformats.org/officeDocument/2006/relationships" xmlns:m="http://schemas.openxmlformats.org/officeDocument/2006/math" xmlns:v="urn:schemas-microsoft-com:vml" xmlns:wp14="http://schemas.microsoft.com/office/word/2010/wordprocessingDrawing" xmlns:wp="http://schemas.openxmlformats.org/drawingml/2006/wordprocessingDrawing" xmlns:w10="urn:schemas-microsoft-com:office:word" xmlns:w="http://schemas.openxmlformats.org/wordprocessingml/2006/main" xmlns:w14="http://schemas.microsoft.com/office/word/2010/wordml" xmlns:w15="http://schemas.microsoft.com/office/word/2012/wordml" xmlns:w16cex="http://schemas.microsoft.com/office/word/2018/wordml/cex" xmlns:w16cid="http://schemas.microsoft.com/office/word/2016/wordml/cid" xmlns:w16="http://schemas.microsoft.com/office/word/2018/wordml" xmlns:w16du="http://schemas.microsoft.com/office/word/2023/wordml/word16du" xmlns:w16sdtdh="http://schemas.microsoft.com/office/word/2020/wordml/sdtdatahash" xmlns:w16sdtfl="http://schemas.microsoft.com/office/word/2024/wordml/sdtformatlock" xmlns:w16se="http://schemas.microsoft.com/office/word/2015/wordml/symex" xmlns:wpg="http://schemas.microsoft.com/office/word/2010/wordprocessingGroup" xmlns:wpi="http://schemas.microsoft.com/office/word/2010/wordprocessingInk" xmlns:wne="http://schemas.microsoft.com/office/word/2006/wordml" xmlns:wps="http://schemas.microsoft.com/office/word/2010/wordprocessingShape" mc:Ignorable="w14 w15 w16se w16cid w16 w16cex w16sdtdh w16sdtfl w16du wp14">
+  <w:footnote w:type="separator" w:id="-1">
+    <w:p>
+      <w:pPr>
+        <w:spacing w:line="240" w:lineRule="auto"/>
+      </w:pPr>
+      <w:r>
+        <w:separator/>
+      </w:r>
+    </w:p>
+  </w:footnote>
+  <w:footnote w:type="continuationSeparator" w:id="0">
+    <w:p>
+      <w:pPr>
+        <w:spacing w:line="240" w:lineRule="auto"/>
+      </w:pPr>
+      <w:r>
+        <w:continuationSeparator/>
+      </w:r>
+    </w:p>
+  </w:footnote>
+  <w:footnote w:id="1">
+    <w:p>
+      <w:pPr>
+        <w:pStyle w:val="Notedebasdepage"/>
+        <w:rPr>
+          <w:lang w:val="en-US"/>
+        </w:rPr>
+      </w:pPr>
+      <w:r>
+        <w:rPr>
+          <w:rStyle w:val="Appelnotedebasdep"/>
+        </w:rPr>
+        <w:footnoteRef/>
+      </w:r>
+      <w:r>
+        <w:rPr>
+          <w:lang w:val="en-US"/>
+        </w:rPr>
+        <w:t xml:space="preserve"> Radke J.et L. Mu (2000). “Spatial decomposition, modeling and mapping service regions</w:t>
+      </w:r>
+    </w:p>
+    <w:p>
+      <w:pPr>
+        <w:pStyle w:val="Notedebasdepage"/>
+        <w:rPr>
+          <w:lang w:val="en-US"/>
+        </w:rPr>
+      </w:pPr>
+      <w:r>
+        <w:rPr>
+          <w:lang w:val="en-US"/>
+        </w:rPr>
+        <w:t xml:space="preserve">to predict access to social programs”, </w:t>
+      </w:r>
+      <w:r>
+        <w:rPr>
+          <w:i/>
+          <w:iCs/>
+          <w:lang w:val="en-US"/>
+        </w:rPr>
+        <w:t xml:space="preserve">Geographic Information Sciences </w:t>
+      </w:r>
+      <w:r>
+        <w:rPr>
+          <w:lang w:val="en-US"/>
+        </w:rPr>
+        <w:t>6, 105–112.</w:t>
+      </w:r>
+    </w:p>
+    <w:p>
+      <w:pPr>
+        <w:pStyle w:val="Notedebasdepage"/>
+        <w:rPr>
+          <w:lang w:val="en-US"/>
+        </w:rPr>
+      </w:pPr>
+    </w:p>
+  </w:footnote>
+  <w:footnote w:id="2">
+    <w:p>
+      <w:pPr>
+        <w:pStyle w:val="Notedebasdepage"/>
+        <w:rPr>
+          <w:i/>
+          <w:iCs/>
+        </w:rPr>
+      </w:pPr>
+      <w:r>
+        <w:rPr>
+          <w:rStyle w:val="Appelnotedebasdep"/>
+        </w:rPr>
+        <w:footnoteRef/>
+      </w:r>
+      <w:r>
+        <w:t xml:space="preserve"> </w:t>
+      </w:r>
+      <w:r>
+        <w:t xml:space="preserve">Wang, F., Luo, W. (2005). </w:t>
+      </w:r>
+      <w:r>
+        <w:rPr>
+          <w:i/>
+          <w:iCs/>
+        </w:rPr>
+        <w:t>“Assessing spatial and nonspatial factors for healthcare</w:t>
+      </w:r>
+    </w:p>
+    <w:p>
+      <w:pPr>
+        <w:pStyle w:val="Notedebasdepage"/>
+      </w:pPr>
+      <w:r>
+        <w:rPr>
+          <w:i/>
+          <w:iCs/>
+        </w:rPr>
+        <w:t>access: towards an integrated approach to defining health professional shortage areas”</w:t>
+      </w:r>
+      <w:r>
+        <w:t>,</w:t>
+      </w:r>
+    </w:p>
+    <w:p>
+      <w:pPr>
+        <w:pStyle w:val="Notedebasdepage"/>
+      </w:pPr>
+      <w:r>
+        <w:rPr>
+          <w:i/>
+          <w:iCs/>
+        </w:rPr>
+        <w:t xml:space="preserve">Health and Place </w:t>
+      </w:r>
+      <w:r>
+        <w:t>11, 131–146.</w:t>
+      </w:r>
+    </w:p>
+  </w:footnote>
+</w:footnotes>
 </file>
 
 <file path=word/numbering.xml><?xml version="1.0" encoding="utf-8"?>
@@ -15198,6 +16140,119 @@
     </w:lvl>
   </w:abstractNum>
   <w:abstractNum w:abstractNumId="25" w15:restartNumberingAfterBreak="0">
+    <w:nsid w:val="499F14F9"/>
+    <w:multiLevelType w:val="hybridMultilevel"/>
+    <w:tmpl w:val="860CEACC"/>
+    <w:lvl w:ilvl="0" w:tplc="040C0001">
+      <w:start w:val="1"/>
+      <w:numFmt w:val="bullet"/>
+      <w:lvlText w:val=""/>
+      <w:lvlJc w:val="left"/>
+      <w:pPr>
+        <w:ind w:left="720" w:hanging="360"/>
+      </w:pPr>
+      <w:rPr>
+        <w:rFonts w:ascii="Symbol" w:hAnsi="Symbol" w:hint="default"/>
+      </w:rPr>
+    </w:lvl>
+    <w:lvl w:ilvl="1" w:tplc="040C0003" w:tentative="1">
+      <w:start w:val="1"/>
+      <w:numFmt w:val="bullet"/>
+      <w:lvlText w:val="o"/>
+      <w:lvlJc w:val="left"/>
+      <w:pPr>
+        <w:ind w:left="1440" w:hanging="360"/>
+      </w:pPr>
+      <w:rPr>
+        <w:rFonts w:ascii="Courier New" w:hAnsi="Courier New" w:cs="Courier New" w:hint="default"/>
+      </w:rPr>
+    </w:lvl>
+    <w:lvl w:ilvl="2" w:tplc="040C0005" w:tentative="1">
+      <w:start w:val="1"/>
+      <w:numFmt w:val="bullet"/>
+      <w:lvlText w:val=""/>
+      <w:lvlJc w:val="left"/>
+      <w:pPr>
+        <w:ind w:left="2160" w:hanging="360"/>
+      </w:pPr>
+      <w:rPr>
+        <w:rFonts w:ascii="Wingdings" w:hAnsi="Wingdings" w:hint="default"/>
+      </w:rPr>
+    </w:lvl>
+    <w:lvl w:ilvl="3" w:tplc="040C0001" w:tentative="1">
+      <w:start w:val="1"/>
+      <w:numFmt w:val="bullet"/>
+      <w:lvlText w:val=""/>
+      <w:lvlJc w:val="left"/>
+      <w:pPr>
+        <w:ind w:left="2880" w:hanging="360"/>
+      </w:pPr>
+      <w:rPr>
+        <w:rFonts w:ascii="Symbol" w:hAnsi="Symbol" w:hint="default"/>
+      </w:rPr>
+    </w:lvl>
+    <w:lvl w:ilvl="4" w:tplc="040C0003" w:tentative="1">
+      <w:start w:val="1"/>
+      <w:numFmt w:val="bullet"/>
+      <w:lvlText w:val="o"/>
+      <w:lvlJc w:val="left"/>
+      <w:pPr>
+        <w:ind w:left="3600" w:hanging="360"/>
+      </w:pPr>
+      <w:rPr>
+        <w:rFonts w:ascii="Courier New" w:hAnsi="Courier New" w:cs="Courier New" w:hint="default"/>
+      </w:rPr>
+    </w:lvl>
+    <w:lvl w:ilvl="5" w:tplc="040C0005" w:tentative="1">
+      <w:start w:val="1"/>
+      <w:numFmt w:val="bullet"/>
+      <w:lvlText w:val=""/>
+      <w:lvlJc w:val="left"/>
+      <w:pPr>
+        <w:ind w:left="4320" w:hanging="360"/>
+      </w:pPr>
+      <w:rPr>
+        <w:rFonts w:ascii="Wingdings" w:hAnsi="Wingdings" w:hint="default"/>
+      </w:rPr>
+    </w:lvl>
+    <w:lvl w:ilvl="6" w:tplc="040C0001" w:tentative="1">
+      <w:start w:val="1"/>
+      <w:numFmt w:val="bullet"/>
+      <w:lvlText w:val=""/>
+      <w:lvlJc w:val="left"/>
+      <w:pPr>
+        <w:ind w:left="5040" w:hanging="360"/>
+      </w:pPr>
+      <w:rPr>
+        <w:rFonts w:ascii="Symbol" w:hAnsi="Symbol" w:hint="default"/>
+      </w:rPr>
+    </w:lvl>
+    <w:lvl w:ilvl="7" w:tplc="040C0003" w:tentative="1">
+      <w:start w:val="1"/>
+      <w:numFmt w:val="bullet"/>
+      <w:lvlText w:val="o"/>
+      <w:lvlJc w:val="left"/>
+      <w:pPr>
+        <w:ind w:left="5760" w:hanging="360"/>
+      </w:pPr>
+      <w:rPr>
+        <w:rFonts w:ascii="Courier New" w:hAnsi="Courier New" w:cs="Courier New" w:hint="default"/>
+      </w:rPr>
+    </w:lvl>
+    <w:lvl w:ilvl="8" w:tplc="040C0005" w:tentative="1">
+      <w:start w:val="1"/>
+      <w:numFmt w:val="bullet"/>
+      <w:lvlText w:val=""/>
+      <w:lvlJc w:val="left"/>
+      <w:pPr>
+        <w:ind w:left="6480" w:hanging="360"/>
+      </w:pPr>
+      <w:rPr>
+        <w:rFonts w:ascii="Wingdings" w:hAnsi="Wingdings" w:hint="default"/>
+      </w:rPr>
+    </w:lvl>
+  </w:abstractNum>
+  <w:abstractNum w:abstractNumId="26" w15:restartNumberingAfterBreak="0">
     <w:nsid w:val="4CE072CC"/>
     <w:multiLevelType w:val="hybridMultilevel"/>
     <w:tmpl w:val="BD1683B4"/>
@@ -15310,7 +16365,7 @@
       </w:rPr>
     </w:lvl>
   </w:abstractNum>
-  <w:abstractNum w:abstractNumId="26" w15:restartNumberingAfterBreak="0">
+  <w:abstractNum w:abstractNumId="27" w15:restartNumberingAfterBreak="0">
     <w:nsid w:val="50CC64D9"/>
     <w:multiLevelType w:val="multilevel"/>
     <w:tmpl w:val="E04AF638"/>
@@ -15424,7 +16479,7 @@
       </w:rPr>
     </w:lvl>
   </w:abstractNum>
-  <w:abstractNum w:abstractNumId="27" w15:restartNumberingAfterBreak="0">
+  <w:abstractNum w:abstractNumId="28" w15:restartNumberingAfterBreak="0">
     <w:nsid w:val="50FD32A3"/>
     <w:multiLevelType w:val="multilevel"/>
     <w:tmpl w:val="7A42CF96"/>
@@ -15545,7 +16600,7 @@
       </w:rPr>
     </w:lvl>
   </w:abstractNum>
-  <w:abstractNum w:abstractNumId="28" w15:restartNumberingAfterBreak="0">
+  <w:abstractNum w:abstractNumId="29" w15:restartNumberingAfterBreak="0">
     <w:nsid w:val="51A4491D"/>
     <w:multiLevelType w:val="multilevel"/>
     <w:tmpl w:val="5E321AB6"/>
@@ -15631,7 +16686,7 @@
       </w:pPr>
     </w:lvl>
   </w:abstractNum>
-  <w:abstractNum w:abstractNumId="29" w15:restartNumberingAfterBreak="0">
+  <w:abstractNum w:abstractNumId="30" w15:restartNumberingAfterBreak="0">
     <w:nsid w:val="537C7D2A"/>
     <w:multiLevelType w:val="multilevel"/>
     <w:tmpl w:val="06B0D32C"/>
@@ -15780,7 +16835,7 @@
       </w:rPr>
     </w:lvl>
   </w:abstractNum>
-  <w:abstractNum w:abstractNumId="30" w15:restartNumberingAfterBreak="0">
+  <w:abstractNum w:abstractNumId="31" w15:restartNumberingAfterBreak="0">
     <w:nsid w:val="5BA75389"/>
     <w:multiLevelType w:val="multilevel"/>
     <w:tmpl w:val="C3EE3C80"/>
@@ -15869,7 +16924,7 @@
       </w:pPr>
     </w:lvl>
   </w:abstractNum>
-  <w:abstractNum w:abstractNumId="31" w15:restartNumberingAfterBreak="0">
+  <w:abstractNum w:abstractNumId="32" w15:restartNumberingAfterBreak="0">
     <w:nsid w:val="5D194ADF"/>
     <w:multiLevelType w:val="hybridMultilevel"/>
     <w:tmpl w:val="3404E882"/>
@@ -15982,7 +17037,7 @@
       </w:rPr>
     </w:lvl>
   </w:abstractNum>
-  <w:abstractNum w:abstractNumId="32" w15:restartNumberingAfterBreak="0">
+  <w:abstractNum w:abstractNumId="33" w15:restartNumberingAfterBreak="0">
     <w:nsid w:val="616364FC"/>
     <w:multiLevelType w:val="multilevel"/>
     <w:tmpl w:val="E20A1A66"/>
@@ -16131,7 +17186,7 @@
       </w:rPr>
     </w:lvl>
   </w:abstractNum>
-  <w:abstractNum w:abstractNumId="33" w15:restartNumberingAfterBreak="0">
+  <w:abstractNum w:abstractNumId="34" w15:restartNumberingAfterBreak="0">
     <w:nsid w:val="63603586"/>
     <w:multiLevelType w:val="hybridMultilevel"/>
     <w:tmpl w:val="1E88BD22"/>
@@ -16244,7 +17299,7 @@
       </w:rPr>
     </w:lvl>
   </w:abstractNum>
-  <w:abstractNum w:abstractNumId="34" w15:restartNumberingAfterBreak="0">
+  <w:abstractNum w:abstractNumId="35" w15:restartNumberingAfterBreak="0">
     <w:nsid w:val="684D2EAC"/>
     <w:multiLevelType w:val="multilevel"/>
     <w:tmpl w:val="040C001F"/>
@@ -16330,7 +17385,7 @@
       </w:pPr>
     </w:lvl>
   </w:abstractNum>
-  <w:abstractNum w:abstractNumId="35" w15:restartNumberingAfterBreak="0">
+  <w:abstractNum w:abstractNumId="36" w15:restartNumberingAfterBreak="0">
     <w:nsid w:val="69651B13"/>
     <w:multiLevelType w:val="hybridMultilevel"/>
     <w:tmpl w:val="B1661D2A"/>
@@ -16416,7 +17471,7 @@
       </w:pPr>
     </w:lvl>
   </w:abstractNum>
-  <w:abstractNum w:abstractNumId="36" w15:restartNumberingAfterBreak="0">
+  <w:abstractNum w:abstractNumId="37" w15:restartNumberingAfterBreak="0">
     <w:nsid w:val="6E33705D"/>
     <w:multiLevelType w:val="multilevel"/>
     <w:tmpl w:val="F3B06530"/>
@@ -16565,7 +17620,7 @@
       </w:rPr>
     </w:lvl>
   </w:abstractNum>
-  <w:abstractNum w:abstractNumId="37" w15:restartNumberingAfterBreak="0">
+  <w:abstractNum w:abstractNumId="38" w15:restartNumberingAfterBreak="0">
     <w:nsid w:val="70B52CA5"/>
     <w:multiLevelType w:val="hybridMultilevel"/>
     <w:tmpl w:val="CB1C9D2C"/>
@@ -16678,7 +17733,7 @@
       </w:rPr>
     </w:lvl>
   </w:abstractNum>
-  <w:abstractNum w:abstractNumId="38" w15:restartNumberingAfterBreak="0">
+  <w:abstractNum w:abstractNumId="39" w15:restartNumberingAfterBreak="0">
     <w:nsid w:val="72737E63"/>
     <w:multiLevelType w:val="hybridMultilevel"/>
     <w:tmpl w:val="7CF8C436"/>
@@ -16767,7 +17822,7 @@
       </w:pPr>
     </w:lvl>
   </w:abstractNum>
-  <w:abstractNum w:abstractNumId="39" w15:restartNumberingAfterBreak="0">
+  <w:abstractNum w:abstractNumId="40" w15:restartNumberingAfterBreak="0">
     <w:nsid w:val="7550553A"/>
     <w:multiLevelType w:val="hybridMultilevel"/>
     <w:tmpl w:val="4CA0F02C"/>
@@ -16856,7 +17911,7 @@
       </w:pPr>
     </w:lvl>
   </w:abstractNum>
-  <w:abstractNum w:abstractNumId="40" w15:restartNumberingAfterBreak="0">
+  <w:abstractNum w:abstractNumId="41" w15:restartNumberingAfterBreak="0">
     <w:nsid w:val="772462E7"/>
     <w:multiLevelType w:val="hybridMultilevel"/>
     <w:tmpl w:val="27AA1A2E"/>
@@ -16969,7 +18024,7 @@
       </w:rPr>
     </w:lvl>
   </w:abstractNum>
-  <w:abstractNum w:abstractNumId="41" w15:restartNumberingAfterBreak="0">
+  <w:abstractNum w:abstractNumId="42" w15:restartNumberingAfterBreak="0">
     <w:nsid w:val="77AC5904"/>
     <w:multiLevelType w:val="hybridMultilevel"/>
     <w:tmpl w:val="4F500678"/>
@@ -17082,7 +18137,7 @@
       </w:rPr>
     </w:lvl>
   </w:abstractNum>
-  <w:abstractNum w:abstractNumId="42" w15:restartNumberingAfterBreak="0">
+  <w:abstractNum w:abstractNumId="43" w15:restartNumberingAfterBreak="0">
     <w:nsid w:val="77D922E5"/>
     <w:multiLevelType w:val="multilevel"/>
     <w:tmpl w:val="B8C8653A"/>
@@ -17199,7 +18254,7 @@
       </w:rPr>
     </w:lvl>
   </w:abstractNum>
-  <w:abstractNum w:abstractNumId="43" w15:restartNumberingAfterBreak="0">
+  <w:abstractNum w:abstractNumId="44" w15:restartNumberingAfterBreak="0">
     <w:nsid w:val="78CE5521"/>
     <w:multiLevelType w:val="multilevel"/>
     <w:tmpl w:val="1708E106"/>
@@ -17348,7 +18403,7 @@
       </w:rPr>
     </w:lvl>
   </w:abstractNum>
-  <w:abstractNum w:abstractNumId="44" w15:restartNumberingAfterBreak="0">
+  <w:abstractNum w:abstractNumId="45" w15:restartNumberingAfterBreak="0">
     <w:nsid w:val="7BCA38D8"/>
     <w:multiLevelType w:val="multilevel"/>
     <w:tmpl w:val="F8DEFE9A"/>
@@ -17461,7 +18516,7 @@
       </w:rPr>
     </w:lvl>
   </w:abstractNum>
-  <w:abstractNum w:abstractNumId="45" w15:restartNumberingAfterBreak="0">
+  <w:abstractNum w:abstractNumId="46" w15:restartNumberingAfterBreak="0">
     <w:nsid w:val="7D741DAF"/>
     <w:multiLevelType w:val="multilevel"/>
     <w:tmpl w:val="FF805DAE"/>
@@ -17551,22 +18606,22 @@
     <w:abstractNumId w:val="2"/>
   </w:num>
   <w:num w:numId="2" w16cid:durableId="1276405205">
-    <w:abstractNumId w:val="31"/>
+    <w:abstractNumId w:val="32"/>
   </w:num>
   <w:num w:numId="3" w16cid:durableId="1236206281">
-    <w:abstractNumId w:val="40"/>
+    <w:abstractNumId w:val="41"/>
   </w:num>
   <w:num w:numId="4" w16cid:durableId="449780836">
-    <w:abstractNumId w:val="35"/>
+    <w:abstractNumId w:val="36"/>
   </w:num>
   <w:num w:numId="5" w16cid:durableId="738863463">
-    <w:abstractNumId w:val="34"/>
+    <w:abstractNumId w:val="35"/>
   </w:num>
   <w:num w:numId="6" w16cid:durableId="199125771">
     <w:abstractNumId w:val="24"/>
   </w:num>
   <w:num w:numId="7" w16cid:durableId="1432553461">
-    <w:abstractNumId w:val="33"/>
+    <w:abstractNumId w:val="34"/>
   </w:num>
   <w:num w:numId="8" w16cid:durableId="1941986744">
     <w:abstractNumId w:val="10"/>
@@ -17575,7 +18630,7 @@
     <w:abstractNumId w:val="13"/>
   </w:num>
   <w:num w:numId="10" w16cid:durableId="2090957216">
-    <w:abstractNumId w:val="28"/>
+    <w:abstractNumId w:val="29"/>
   </w:num>
   <w:num w:numId="11" w16cid:durableId="348146315">
     <w:abstractNumId w:val="0"/>
@@ -17587,28 +18642,28 @@
     <w:abstractNumId w:val="4"/>
   </w:num>
   <w:num w:numId="14" w16cid:durableId="1762872592">
-    <w:abstractNumId w:val="45"/>
+    <w:abstractNumId w:val="46"/>
   </w:num>
   <w:num w:numId="15" w16cid:durableId="221528944">
-    <w:abstractNumId w:val="30"/>
+    <w:abstractNumId w:val="31"/>
   </w:num>
   <w:num w:numId="16" w16cid:durableId="2056659511">
     <w:abstractNumId w:val="23"/>
   </w:num>
   <w:num w:numId="17" w16cid:durableId="1319528703">
-    <w:abstractNumId w:val="26"/>
+    <w:abstractNumId w:val="27"/>
   </w:num>
   <w:num w:numId="18" w16cid:durableId="892426557">
     <w:abstractNumId w:val="12"/>
   </w:num>
   <w:num w:numId="19" w16cid:durableId="1870950917">
-    <w:abstractNumId w:val="42"/>
+    <w:abstractNumId w:val="43"/>
   </w:num>
   <w:num w:numId="20" w16cid:durableId="1269267001">
     <w:abstractNumId w:val="15"/>
   </w:num>
   <w:num w:numId="21" w16cid:durableId="1996953120">
-    <w:abstractNumId w:val="42"/>
+    <w:abstractNumId w:val="43"/>
     <w:lvlOverride w:ilvl="0">
       <w:startOverride w:val="1"/>
     </w:lvlOverride>
@@ -17638,13 +18693,13 @@
     </w:lvlOverride>
   </w:num>
   <w:num w:numId="22" w16cid:durableId="943656833">
-    <w:abstractNumId w:val="37"/>
+    <w:abstractNumId w:val="38"/>
   </w:num>
   <w:num w:numId="23" w16cid:durableId="658657541">
-    <w:abstractNumId w:val="41"/>
+    <w:abstractNumId w:val="42"/>
   </w:num>
   <w:num w:numId="24" w16cid:durableId="2044135669">
-    <w:abstractNumId w:val="25"/>
+    <w:abstractNumId w:val="26"/>
   </w:num>
   <w:num w:numId="25" w16cid:durableId="1565674698">
     <w:abstractNumId w:val="5"/>
@@ -17665,16 +18720,16 @@
     <w:abstractNumId w:val="6"/>
   </w:num>
   <w:num w:numId="31" w16cid:durableId="1007636094">
-    <w:abstractNumId w:val="36"/>
+    <w:abstractNumId w:val="37"/>
   </w:num>
   <w:num w:numId="32" w16cid:durableId="622538418">
     <w:abstractNumId w:val="20"/>
   </w:num>
   <w:num w:numId="33" w16cid:durableId="537085489">
-    <w:abstractNumId w:val="32"/>
+    <w:abstractNumId w:val="33"/>
   </w:num>
   <w:num w:numId="34" w16cid:durableId="2052873317">
-    <w:abstractNumId w:val="29"/>
+    <w:abstractNumId w:val="30"/>
   </w:num>
   <w:num w:numId="35" w16cid:durableId="1557664099">
     <w:abstractNumId w:val="19"/>
@@ -17692,7 +18747,7 @@
     <w:abstractNumId w:val="7"/>
   </w:num>
   <w:num w:numId="40" w16cid:durableId="382752654">
-    <w:abstractNumId w:val="43"/>
+    <w:abstractNumId w:val="44"/>
   </w:num>
   <w:num w:numId="41" w16cid:durableId="10800">
     <w:abstractNumId w:val="11"/>
@@ -17701,19 +18756,22 @@
     <w:abstractNumId w:val="16"/>
   </w:num>
   <w:num w:numId="43" w16cid:durableId="416293734">
-    <w:abstractNumId w:val="27"/>
+    <w:abstractNumId w:val="28"/>
   </w:num>
   <w:num w:numId="44" w16cid:durableId="1100562306">
-    <w:abstractNumId w:val="39"/>
+    <w:abstractNumId w:val="40"/>
   </w:num>
   <w:num w:numId="45" w16cid:durableId="132404547">
-    <w:abstractNumId w:val="38"/>
+    <w:abstractNumId w:val="39"/>
   </w:num>
   <w:num w:numId="46" w16cid:durableId="596211566">
     <w:abstractNumId w:val="22"/>
   </w:num>
   <w:num w:numId="47" w16cid:durableId="284897809">
-    <w:abstractNumId w:val="44"/>
+    <w:abstractNumId w:val="45"/>
+  </w:num>
+  <w:num w:numId="48" w16cid:durableId="917716273">
+    <w:abstractNumId w:val="25"/>
   </w:num>
 </w:numbering>
 </file>
@@ -18334,7 +19392,6 @@
   <w:style w:type="character" w:default="1" w:styleId="Policepardfaut">
     <w:name w:val="Default Paragraph Font"/>
     <w:uiPriority w:val="1"/>
-    <w:semiHidden/>
     <w:unhideWhenUsed/>
   </w:style>
   <w:style w:type="table" w:default="1" w:styleId="TableauNormal">
@@ -18784,6 +19841,45 @@
       <w:szCs w:val="20"/>
     </w:rPr>
   </w:style>
+  <w:style w:type="paragraph" w:styleId="Notedebasdepage">
+    <w:name w:val="footnote text"/>
+    <w:basedOn w:val="Normal"/>
+    <w:link w:val="NotedebasdepageCar"/>
+    <w:uiPriority w:val="99"/>
+    <w:semiHidden/>
+    <w:unhideWhenUsed/>
+    <w:rsid w:val="00750520"/>
+    <w:pPr>
+      <w:spacing w:line="240" w:lineRule="auto"/>
+    </w:pPr>
+    <w:rPr>
+      <w:sz w:val="20"/>
+      <w:szCs w:val="20"/>
+    </w:rPr>
+  </w:style>
+  <w:style w:type="character" w:customStyle="1" w:styleId="NotedebasdepageCar">
+    <w:name w:val="Note de bas de page Car"/>
+    <w:basedOn w:val="Policepardfaut"/>
+    <w:link w:val="Notedebasdepage"/>
+    <w:uiPriority w:val="99"/>
+    <w:semiHidden/>
+    <w:rsid w:val="00750520"/>
+    <w:rPr>
+      <w:sz w:val="20"/>
+      <w:szCs w:val="20"/>
+    </w:rPr>
+  </w:style>
+  <w:style w:type="character" w:styleId="Appelnotedebasdep">
+    <w:name w:val="footnote reference"/>
+    <w:basedOn w:val="Policepardfaut"/>
+    <w:uiPriority w:val="99"/>
+    <w:semiHidden/>
+    <w:unhideWhenUsed/>
+    <w:rsid w:val="00750520"/>
+    <w:rPr>
+      <w:vertAlign w:val="superscript"/>
+    </w:rPr>
+  </w:style>
 </w:styles>
 </file>
 

</xml_diff>